<commit_message>
Proofcheck Flour Play German: SIGNIFICANT-borderline (19 fixes)
Co-Authored-By: Claude Opus 5.5 <noreply@anthropic.com>
Claude-Session: https://claude.ai/code/session_012Cm8JxdqzjuttdUSdkQCUg
</commit_message>
<xml_diff>
--- a/translated/corrected/Flour Play - ASSEMBLED - FORMATTED_German.docx
+++ b/translated/corrected/Flour Play - ASSEMBLED - FORMATTED_German.docx
@@ -263,7 +263,7 @@
     <w:p/>
     <w:p>
       <w:r>
-        <w:t>»Irgendjemand muss es ja tun. Ihr tut es ja von selbst nicht.« Sie war bereits dabei, den Deckel abzuheben. Der Duft drang hervor und vermischte sich in der Raummitte mit dem Balsamduft, Schokolade und brauner Zucker über kaltem, grünem Kieferngrün. Das war, wie ich fand, dem Geruch der kommenden Jahreszeit so nah wie alles, was ich kannte. »Und ganz unten sind Ingwerkekse, also nehmt bloß nicht nur die Cupcakes und lasst die Kekse liegen, Dot, ich habe gesehen, wie du das beim Grange gemacht hast, und ich habe das nicht vergessen.«</w:t>
+        <w:t>»Irgendjemand muss es ja tun. Ihr tut es ja von selbst nicht.« Sie war bereits dabei, den Deckel abzuheben. Der Duft drang hervor und vermischte sich in der Raummitte mit dem Balsamduft, Schokolade und brauner Zucker über kaltem, grünem Kieferngrün. Das war, wie ich fand, dem Geruch der kommenden Jahreszeit so nah wie alles, was ich kannte. »Und ganz unten sind Ingwerkekse, also nehmt bloß nicht nur die Cupcakes und lasst die Kekse liegen, Dot, ich habe gesehen, wie du das bei der Grange gemacht hast, und ich habe das nicht vergessen.«</w:t>
       </w:r>
     </w:p>
     <w:p/>
@@ -1543,7 +1543,7 @@
     <w:p/>
     <w:p>
       <w:r>
-        <w:t>»Im Juli hat er das Tor mit einer Kette versperrt, damit ihr Mehl nicht durchkam«, sagte Dot. »Sie hat ihm deswegen das Ordnungsamt auf den Hals gehetzt. Er hat sich revanchiert und sie wegen Ratten an ihren Mülltonnen angerufen.« Sie knipste einen Draht ab. »Eine verdammt miese Behauptung über eine Bäckerin. Das wusste er auch. Und Tom sagt, Pete sei in letzter Zeit zu jeder Tages- und Nachtzeit in dieser Gasse gewesen. Vor Sonnenaufgang. Nach Ladenschluss.«</w:t>
+        <w:t>»Im Juli hat er das Tor mit einer Kette versperrt, damit ihr Mehl nicht durchkam«, sagte Dot. »Sie hat ihm deswegen das Ordnungsamt auf den Hals gehetzt. Er hat sich revanchiert und seinerseits dort wegen Ratten an ihren Mülltonnen angerufen.« Sie knipste einen Draht ab. »Eine verdammt miese Behauptung über eine Bäckerin. Das wusste er auch. Und Tom sagt, Pete sei in letzter Zeit zu jeder Tages- und Nachtzeit in dieser Gasse gewesen. Vor Sonnenaufgang. Nach Ladenschluss.«</w:t>
       </w:r>
     </w:p>
     <w:p/>
@@ -1896,7 +1896,7 @@
     <w:p/>
     <w:p>
       <w:r>
-        <w:t xml:space="preserve">Ich hatte sie seither nicht mehr direkt angesehen. Es war keine einfache Schachtel, die man direkt ansehen konnte, bei dem, was sie in sich trug und was sie für diese Stadt bedeutete nach dem Herbst, den wir alle hinter uns hatten, nachdem sie Ende Oktober aus der kalten Erde unter dem Dorfanger aufgetaucht war, versiegelt für hundert Jahre und mehr. Niemand hatte sie im rohen Schmerz der Jahreszeit, in der sie gefunden wurde, aufgerissen. Stattdessen hatten sie sie hier hinter sauberem Glas aufgestellt, bis zum neuen Jahr. Eine handbeschriftete Karte lehnte dagegen. </w:t>
+        <w:t xml:space="preserve">Ich hatte sie seither nicht mehr direkt angesehen. Es war keine einfache Schachtel, die man direkt ansehen konnte, bei dem, was sie in sich trug und was sie für diese Stadt bedeutete nach dem Herbst, den wir alle hinter uns hatten, nachdem sie Ende Oktober aus der kalten Erde unter dem Anger aufgetaucht war, versiegelt für hundert Jahre und mehr. Niemand hatte sie im rohen Schmerz der Jahreszeit, in der sie gefunden wurde, aufgerissen. Stattdessen hatten sie sie hier hinter sauberem Glas aufgestellt, bis zum neuen Jahr. Eine handbeschriftete Karte lehnte dagegen. </w:t>
       </w:r>
       <w:r>
         <w:rPr>
@@ -2426,7 +2426,7 @@
     </w:p>
     <w:p>
       <w:r>
-        <w:t>»Das ist das Zuhause, das ich für sie baue, damit sie sich nicht länger die Schneemänner ausleiht.« Ein müdes, echtes Lächeln. »Es ist noch nicht so weit. Es dauert noch Jahre, bis alles fertig ist. Aber es ist ein Anfang, und bis es vollbracht ist, wird sie weiterhin Kerzen golden anstrahlen und die Schneemänner der Kinder im Dunkeln herumspazieren lassen, weil sie hier sein will und keine eigenen Beine besitzt. Bram ist völlig aus dem Häuschen. Findet es unwürdig, dass Magie sich in der Öffentlichkeit so aufführt, dass die Stadt es sehen kann. Am liebsten würde er sie mit den Rentieren in den Stall sperren, und hätte ungefähr so viel Glück dabei, sie dort festzuhalten.«</w:t>
+        <w:t>»Das ist das Zuhause, das ich für sie baue, damit sie sich nicht länger die Schneemänner ausleiht.« Ein müdes, echtes Lächeln. »Es ist noch nicht so weit. Es dauert noch Jahre, bis alles fertig ist. Aber es ist ein Anfang, und bis es vollbracht ist, wird sie weiterhin Kerzen golden anstrahlen und die Schneemänner der Kinder im Dunkeln herumspazieren lassen, weil sie hier sein will und keine eigenen Beine besitzt. Bram ist völlig aus dem Häuschen. Findet es unwürdig, dass Magie sich in der Öffentlichkeit so aufführt, dass die Stadt es sehen kann. Am liebsten würde er sie mit den Rentieren auf der Koppel einsperren, und hätte ungefähr so viel Glück dabei, sie dort festzuhalten.«</w:t>
       </w:r>
     </w:p>
     <w:p>
@@ -2713,7 +2713,7 @@
     <w:p/>
     <w:p>
       <w:r>
-        <w:t xml:space="preserve">Aber ich stand in der Kälte und beobachtete auch das andere Geschehen, klein und leise im Schatten des Zusammenhalts. Ein Mann, den ich flüchtig kannte, blieb mit seinem Jungen am Fenster stehen, las den Aushang und zog den Jungen weiter. Nicht unfreundlich. Nur vorsichtig. Eine Frau sagte leise zu einer anderen, ohne zu wissen, dass ich in der Nähe stand: »Na ja, die schließen einen ja nicht grundlos, oder?«, und die andere erwiderte: »Nein, ich schätze wohl nicht.« Keine von beiden wollte Greta auch nur das Geringste Böse, und beide rückten sie, ohne zu wissen, was sie damit angerichtet hatten, in ihren Köpfen ein Stückchen weiter von der Sicherheit weg. Das war die Waffe. Die Schließung würde aufgehoben und das gelbe Papier abgenommen werden, aber der Zweifel nicht. Das Siegel des Landkreises gab einem anständigen, zweifelnden Menschen das Recht zu sagen: </w:t>
+        <w:t xml:space="preserve">Aber ich stand in der Kälte und beobachtete auch das andere Geschehen, klein und leise im Schatten des Zusammenhalts. Ein Mann, den ich flüchtig kannte, blieb mit seinem Jungen am Fenster stehen, las den Aushang und zog den Jungen weiter. Nicht unfreundlich. Nur vorsichtig. Eine Frau sagte leise zu einer anderen, ohne zu wissen, dass ich in der Nähe stand: »Na ja, die schließen einen ja nicht grundlos, oder?«, und die andere erwiderte: »Nein, ich schätze wohl nicht.« Keine von beiden wollte Greta auch nur im Geringsten Böses, und beide rückten sie, ohne zu wissen, was sie damit angerichtet hatten, in ihren Köpfen ein Stückchen weiter von der Sicherheit weg. Das war die Waffe. Die Schließung würde aufgehoben und das gelbe Papier abgenommen werden, aber der Zweifel nicht. Das Siegel des Landkreises gab einem anständigen, zweifelnden Menschen das Recht zu sagen: </w:t>
       </w:r>
       <w:r>
         <w:rPr>
@@ -3176,7 +3176,7 @@
     <w:p/>
     <w:p>
       <w:r>
-        <w:t>Ich stand in der Kälte an Gretas Hintertür und betrachtete das, was jeder sehen würde, der dort stand. Die Schwelle, an der die Säcke ankamen. Das Dunkel des Hinterzimmers jenseits davon. Und durch den Raum hindurch, klein und hell, weit entfernt, das Maul ihrer Öfen, wo sie sich aufhalten musste. Eine Person an dieser Schwelle im Dunkeln hätte das gesamte warme Herz ihres Ladens wie eine Bühne vor sich, während sie selbst in den Kulissen stand, wohin das Licht nicht reichte. Sie würde sie sehen, bevor diese sie erblicken konnte. Sie würde die Ventilatoren hören und wissen, dass Greta sie nicht hörte. Und sie hätte all die Zeit, die sie brauchte.</w:t>
+        <w:t>Ich stand in der Kälte an Gretas Hintertür und betrachtete das, was jeder sehen würde, der dort stand. Die Schwelle, an der die Säcke ankamen. Das Dunkel des Hinterzimmers jenseits davon. Und durch den Raum hindurch, klein und hell, weit entfernt, das Maul ihrer Öfen, wo sie sich aufhalten musste. Wer an dieser Schwelle im Dunkeln stünde, hätte das gesamte warme Herz ihres Ladens wie eine Bühne vor sich und stünde selbst in den Kulissen, wohin das Licht nicht reichte. Er würde sie sehen, bevor sie ihn sehen konnte. Er würde die Ventilatoren hören und wissen, dass sie ihn nicht hörte. Und er hätte all die Zeit, die er brauchte.</w:t>
       </w:r>
     </w:p>
     <w:p/>
@@ -3278,7 +3278,7 @@
     <w:p/>
     <w:p>
       <w:r>
-        <w:t>»Mir gefällt ebenfalls nicht, wohin die Karte zeigt«, sagte ich. Ich warf noch einen letzten Blick in den kalten Schlund der Rampe, auf Gretas niedrige Tür, die bis zu dem Ziegelstein jeden dunklen Morgen zur Hälfte offen gestanden hatte, und drei Türen weiter auf das Tor des Metzgers, wo ein anständiger Mann jeden erdenklichen Grund auf der Welt haben konnte, vor dem Morgengrauen dort zu sein. »Letzte Woche war er mir lieber. Da war es nur eine Kette und etwas Geschrei. Am Zugang kommt man bei einem Mann nicht so leicht vorbei.«</w:t>
+        <w:t>»Mir gefällt ebenfalls nicht, wohin die Karte zeigt«, sagte ich. Ich warf noch einen letzten Blick in den kalten Schlund der Rampe, auf Gretas niedrige Tür, die bis zu dem Ziegelstein jeden dunklen Morgen die halbe Zeit offen gestanden hatte, und drei Türen weiter auf das Tor des Metzgers, wo ein anständiger Mann jeden erdenklichen Grund auf der Welt haben konnte, vor dem Morgengrauen dort zu sein. »Letzte Woche war er mir lieber. Da war es nur eine Kette und etwas Geschrei. Am Zugang kommt man bei einem Mann nicht so leicht vorbei.«</w:t>
       </w:r>
     </w:p>
     <w:p/>
@@ -4396,7 +4396,7 @@
     <w:p/>
     <w:p>
       <w:r>
-        <w:t>Doc Mitchell saß an seiner Werkbank, vor ihm ein Sack Hafer für Bauern, der offen vor ihm lag, und mit einer Lupe in der Hand. Er sah auf, als ich eintrat, und blickte dann auf das Einmachglas, das ich neben den Hafer stellte.</w:t>
+        <w:t>Doc Mitchell saß an seiner Werkbank, vor sich den offenen Hafersack eines Farmers und eine Lupe in der Hand. Er sah auf, als ich eintrat, und blickte dann auf das Einmachglas, das ich neben den Hafer stellte.</w:t>
       </w:r>
     </w:p>
     <w:p/>
@@ -4684,7 +4684,7 @@
     <w:p/>
     <w:p>
       <w:r>
-        <w:t>Ich hatte auf jener Bank gesessen und mit Danny Ott gedacht, die Leute hätten zu schnell geurteilt. Ich hatte zugesehen, wie sie das bei Pete wegen einer Kette an einem Tor taten und bei den Doucettes wegen einer Ölrechnung. Ich hatte bei Renée Duval genau dasselbe getan, nur eben im Stillen, wo mir niemand sagen konnte, dass ich unrecht hatte. Doc hätte es gekonnt. Ich hatte ihn mitgenommen, weil ich mir so sicher gewesen war, er würde das nicht tun.</w:t>
+        <w:t>Ich hatte mit Danny Ott auf jener Bank gesessen und gedacht, die Leute hätten zu schnell geurteilt. Ich hatte zugesehen, wie sie das bei Pete wegen einer Kette an einem Tor taten und bei den Doucettes wegen einer Ölrechnung. Ich hatte bei Renée Duval genau dasselbe getan, nur eben im Stillen, wo mir niemand sagen konnte, dass ich unrecht hatte. Doc hätte es gekonnt. Ich hatte ihn mitgenommen, weil ich mir so sicher gewesen war, er würde das nicht tun.</w:t>
       </w:r>
     </w:p>
     <w:p/>
@@ -4713,7 +4713,7 @@
     <w:p/>
     <w:p>
       <w:r>
-        <w:t>Der Frost kam ganz ohne Vorwarnung im Wetter, wie Dot mir versichert hatte, dass die strengen Frostnächte immer kamen. Nur ein wolkenloser, starrer Himmel und eine Temperatur, die die ganze Nacht über sank wie ein geworfener Stein. Ich erwachte in Räumen, deren Fensterscheiben bis in die Ecken mit eisigen Farnmustern bedeckt waren, während die Rohre in meinen Wänden vor Kälte knackten, und ich dachte, ehe ich an irgendetwas anderes dachte, an das schmale Backsteingebäude des Historischen Vereins am Platz und den alten Kessel, der in seinem Keller pochte. Ein Kessel, der bei Tauwetter kaum hinterherkam, hielt einer so kalten Nacht nicht immer stand.</w:t>
+        <w:t>Der Frost kam ganz ohne Vorwarnung im Wetter, so wie die strengen Fröste, hatte Dot mir gesagt, immer kamen. Nur ein wolkenloser, starrer Himmel und eine Temperatur, die die ganze Nacht über sank wie ein geworfener Stein. Ich erwachte in Räumen, deren Fensterscheiben bis in die Ecken mit eisigen Farnmustern bedeckt waren, während die Rohre in meinen Wänden vor Kälte knackten, und ich dachte, ehe ich an irgendetwas anderes dachte, an das schmale Backsteingebäude des Historischen Vereins am Platz und den alten Kessel, der in seinem Keller pochte. Ein Kessel, der bei Tauwetter kaum hinterherkam, hielt einer so kalten Nacht nicht immer stand.</w:t>
       </w:r>
     </w:p>
     <w:p>
@@ -4748,7 +4748,7 @@
     </w:p>
     <w:p>
       <w:r>
-        <w:t>»Ferris wollte für den Kessel aufkommen«, sagte Hal leise, zu niemandem oder zu mir. »Die vollen Kosten, wenn die Stadt das Dach macht. So war die Abmachung. Aber jetzt ist das Dach auch noch kaputt, und das Dach kostet gut und gern doppelt so viel, und Ferris springt in einem guten Jahr für einen Kessel ein, aber in einem schlechten zählt er sein Geld.« Er rieb sich das Gesicht. »Er wird nicht rundweg nein sagen. Er wird sagen, wir sollen bis zum Frühling warten. Bis wir weitersehen. Bis zum Frühling ist der Frost durch die ganze Decke gegangen. Es geht jetzt um die Sammlung, Jessica. Um das Gebäude und alles darin.«</w:t>
+        <w:t>»Ferris wollte für den Kessel aufkommen«, sagte Hal leise, zu niemandem oder zu mir. »Die vollen Kosten, wenn die Stadt das Dach macht. So war die Abmachung. Aber jetzt ist das Dach auch noch kaputt, und das Dach kostet gut die Hälfte mehr, und Ferris springt in einem guten Jahr für einen Kessel ein, aber in einem schlechten zählt er sein Geld.« Er rieb sich das Gesicht. »Er wird nicht rundweg nein sagen. Er wird sagen, wir sollen bis zum Frühling warten. Bis wir weitersehen. Bis zum Frühling ist der Frost durch die ganze Decke gegangen. Es geht jetzt um die Sammlung, Jessica. Um das Gebäude und alles darin.«</w:t>
       </w:r>
     </w:p>
     <w:p>
@@ -5144,7 +5144,7 @@
     </w:p>
     <w:p>
       <w:r>
-        <w:t>»Das war es, was ich glaubte. Dann ging Doc am Donnerstag durch ihr Lager und es gab dort kein Säuerungsmittel, und sie verriet mir, wer ihr von Gretas Fugenmörtel erzählt hatte.« Ich ging nicht weiter darauf ein, da ich mir für die Nacht geschworen hatte, keine Gesichter zu nennen. »Also bleibe ich auf dem Papier sitzen. Ein Flyer ist ein Korrekturabzug auf jemandes Theke, lange bevor er als Flyer am schwarzen Brett hängt. Irgendjemand hat ihn dort gesehen. Irgendjemand hat diese Woche davon abgelesen und dem Landkreis eine Beschwerde geschrieben, damit sie genau hineinfällt.«</w:t>
+        <w:t>»Das war es, was ich glaubte. Dann ging Doc am Donnerstag durch ihr Lager und es gab dort kein Säuerungsmittel, und sie verriet mir, wer ihr von Gretas Fugenmörtel erzählt hatte.« Ich ging nicht weiter darauf ein, da ich mir für die Nacht geschworen hatte, keine Gesichter zu nennen. »Also bleibt mir das Papier. Ein Flyer ist ein Korrekturabzug auf jemandes Theke, lange bevor er als Flyer am schwarzen Brett hängt. Irgendjemand hat ihn dort gesehen. Irgendjemand hat diese Woche davon abgelesen und dem Landkreis eine Beschwerde geschrieben, damit sie genau hineinfällt.«</w:t>
       </w:r>
     </w:p>
     <w:p>
@@ -5694,7 +5694,7 @@
     </w:p>
     <w:p>
       <w:r>
-        <w:t>Das Tageslicht schwand, als ich den Dorfanger überquerte. Pete kehrte Sägemehl vor seine Tür, das Ladenschild war bereits umgedreht und eine letzte Kundin verließ den Laden mit einem Päckchen unter dem Arm. Er ließ mich hinein und kehrte weiter.</w:t>
+        <w:t>Das Tageslicht schwand, als ich den Anger überquerte. Pete kehrte Sägemehl vor seine Tür, das Ladenschild war bereits umgedreht und eine letzte Kundin verließ den Laden mit einem Päckchen unter dem Arm. Er ließ mich hinein und kehrte weiter.</w:t>
       </w:r>
     </w:p>
     <w:p>
@@ -5963,7 +5963,7 @@
     </w:p>
     <w:p>
       <w:r>
-        <w:t>»In der Beschwerde wurde die Kühlzelle ›der Kühlraum‹ und das Handwaschbecken ›das Hobart-Becken‹ genannt. Greta sagt, das hat seit Joyce niemand mehr so genannt. Das Schloss am Hoftor wurde nie ausgetauscht, und Pete meint, es geht immer wieder ab. Und das Sauerwerden hörte genau an dem Morgen auf, an dem Greta anfing, ihre Hintertür nach dem Vorfall mit dem Ziegelstein zu verriegeln, wer auch immer es also tat, kam auf diesem Weg herein. Er sah vor Tagesanbruch einen Lieferwagen oben bei der Apotheke stehen, ohne Licht, nicht den vom Fleischlieferanten. Gestern betrachtete er Claires Ausdruck von dem Lieferwagen der Wendts und sagte: ›Das ist er.‹«</w:t>
+        <w:t>»In der Beschwerde wurde die Kühlzelle ›der Kühlraum‹ und das Handwaschbecken ›das Hobart-Becken‹ genannt. Greta sagt, das hat seit Joyce niemand mehr so genannt. Das Schloss am Hoftor wurde nie ausgetauscht, und Pete meint, es geht immer wieder ab. Und das Sauerwerden hörte genau an dem Morgen auf, an dem Greta anfing, ihre Hintertür nach dem Vorfall mit dem Ziegelstein zu verriegeln, wer auch immer es also tat, kam auf diesem Weg herein. Pete sah vor Tagesanbruch einen Lieferwagen oben bei der Apotheke stehen, ohne Licht, nicht den vom Fleischlieferanten. Gestern betrachtete er Claires Ausdruck mit dem Lieferwagen von Wendt's Bakehouse und sagte: ›Das ist er.‹«</w:t>
       </w:r>
     </w:p>
     <w:p>
@@ -6078,7 +6078,7 @@
     </w:p>
     <w:p>
       <w:r>
-        <w:t>Tanaka rief sie an, und Greta kam kurz darauf in ihrem guten Mantel die Stufen der Wache herauf, den Hut tief ins Gesicht gezogen den Mund gegen einen weiteren Schlag zusammengepresst.</w:t>
+        <w:t>Tanaka rief sie an, und Greta kam kurz darauf in ihrem guten Mantel die Stufen der Wache herauf, den Hut tief ins Gesicht gezogen und den Mund gegen einen weiteren Schlag zusammengepresst.</w:t>
       </w:r>
     </w:p>
     <w:p>
@@ -6350,7 +6350,7 @@
     <w:p/>
     <w:p>
       <w:r>
-        <w:t>»Fünfundzwanzig Jahre«, sagte sie zu Greta. »Du hast ihn nie ausgewechselt. Herrgott, Gret.«</w:t>
+        <w:t>»Fünfundzwanzig Jahre«, sagte sie zu Greta. »Du hast das Schloss nie ausgewechselt. Herrgott, Gret.«</w:t>
       </w:r>
     </w:p>
     <w:p/>
@@ -6649,7 +6649,7 @@
     </w:p>
     <w:p>
       <w:r>
-        <w:t>»Nicht, dass er etwas gefunden hätte. Ein Säuerungsmittel ist ein Lebensmittel. Es ruiniert nur den falschen Teig.« Sie klappte das Notizbuch zu. »Das Krankenhaus wartet allerdings nicht auf ein Gericht. Dessen Leiterin für den Verpflegungsdienst hat mich angerufen, sobald ich die Tür aufgeschlossen hatte, um zu fragen, ob es stimmte. Ich habe ihr gesagt, was öffentlich ist, die Anklagepunkte und ein Gerichtstermin, und sie hat das Konto suspendiert. Der Inspektor sagt, zwei Gasthöfe haben ihren Fahrer angerufen, bevor er mit dem Beladen des Wagens fertig war. Er hat zugesehen, wie das Brot wieder hineingetragen wurde.«</w:t>
+        <w:t>»Nicht, dass er etwas gefunden hätte. Ein Säuerungsmittel ist ein Lebensmittel. Es ruiniert nur den falschen Teig.« Sie klappte das Notizbuch zu. »Das Krankenhaus wartet allerdings nicht auf ein Gericht. Dessen Leiterin für den Verpflegungsdienst hat mich angerufen, sobald ich die Tür aufgeschlossen hatte, um zu fragen, ob es stimmte. Ich habe ihr gesagt, was öffentlich ist, die Anklagepunkte und einen Gerichtstermin, und sie hat das Konto suspendiert. Der Inspektor sagt, zwei Gasthöfe haben ihren Fahrer angerufen, bevor er mit dem Beladen des Wagens fertig war. Er hat zugesehen, wie das Brot wieder hineingetragen wurde.«</w:t>
       </w:r>
     </w:p>
     <w:p>
@@ -7369,7 +7369,7 @@
     </w:p>
     <w:p>
       <w:r>
-        <w:t>Greta stand an dem langen Tisch im Mehl, die Ärmel bis zu den Ellenbogen hochgekrempelt, und bearbeitete ein Blech sternförmiger Plätzchen mit schnellen, geübten Handgriffen. Über Nacht war Reif an den unteren Fensterecken emporgekrochen, und die Scheiben darüber liefen feucht an vom Dampf der Öfen. Vor der Vitrine drängte sich bereits eine kleine Gruppe von Kundschaft, die Mäntel über ihren Päckchen zugeknöpft, und hatten es gar nicht eilig, in den November hinauszugehen.</w:t>
+        <w:t>Greta stand an dem langen Tisch im Mehl, die Ärmel bis zu den Ellenbogen hochgekrempelt, und bearbeitete ein Blech sternförmiger Plätzchen mit schnellen, geübten Handgriffen. Über Nacht war Reif an den unteren Fensterecken emporgekrochen, und die Scheiben darüber liefen feucht an vom Dampf der Öfen. Vor der Vitrine drängte sich bereits ein Grüppchen Kunden, die Mäntel über ihren Päckchen zugeknöpft, die es gar nicht eilig hatten, in den November hinauszugehen.</w:t>
       </w:r>
     </w:p>
     <w:p>
@@ -7656,7 +7656,7 @@
     </w:p>
     <w:p>
       <w:r>
-        <w:t>Das Vermächtnis einer verstorbenen Großtante bietet einen Ausweg – ein staubiges Buchbindergeschäft in dem wie aus dem Bilderbuch entsprungenen Städtchen Pinecrest, das ihr gehört, um es zu verkaufen und zu vergessen. Doch dann bricht die Präsidentin der Historischen Gesellschaft auf der Mondschein-Maskerade zusammen, an ein kleines Ledertagebuch geklammert, und der Sheriff bittet Fiona, diese zu untersuchen.</w:t>
+        <w:t>Das Vermächtnis einer verstorbenen Großtante bietet einen Ausweg – ein staubiges Buchbindergeschäft in dem wie aus dem Bilderbuch entsprungenen Städtchen Pinecrest, das ihr gehört, um es zu verkaufen und zu vergessen. Doch dann bricht die Präsidentin der Historischen Gesellschaft auf der Mondschein-Maskerade zusammen, an ein kleines Ledertagebuch geklammert, und der Sheriff bittet Fiona, es zu untersuchen.</w:t>
       </w:r>
     </w:p>
     <w:p>

</xml_diff>

<commit_message>
Full proofcheck Flour Play German: SIGNIFICANT (79 fixes)
Co-Authored-By: Claude Opus 5.5 <noreply@anthropic.com>
Claude-Session: https://claude.ai/code/session_012Cm8JxdqzjuttdUSdkQCUg
</commit_message>
<xml_diff>
--- a/translated/corrected/Flour Play - ASSEMBLED - FORMATTED_German.docx
+++ b/translated/corrected/Flour Play - ASSEMBLED - FORMATTED_German.docx
@@ -275,7 +275,7 @@
     <w:p/>
     <w:p>
       <w:r>
-        <w:t>Greta richtete rechtfertigend einen bemehlten Finger auf sie und begann, die Cupcakes auf Papierservietten herumzureichen.</w:t>
+        <w:t xml:space="preserve">Greta richtete triumphierend einen bemehlten Finger auf sie und begann, die Cupcakes auf Papierservietten herumzureichen.</w:t>
       </w:r>
     </w:p>
     <w:p/>
@@ -401,7 +401,7 @@
     <w:p/>
     <w:p>
       <w:r>
-        <w:t>»Hinterher die Spuren verwischt«, meinte Dot. »Oder der Wind hat sie weggeweht. Es ist ein Scherz. Ein Kind mit kalten Fingern und nichts Besserem zu tun. Bis zum Wochenende ist die ganze Reihe umgedreht, wirst schon sehen, sobald die anderen merken, dass das geht.«</w:t>
+        <w:t xml:space="preserve">»Hinterher die Spuren verwischt«, meinte Dot. »Oder der Wind hat sie zugeweht. Es ist ein Scherz. Ein Kind mit kalten Fingern und nichts Besserem zu tun. Bis zum Wochenende ist die ganze Reihe umgedreht, wirst schon sehen, sobald die anderen merken, dass das geht.«</w:t>
       </w:r>
     </w:p>
     <w:p/>
@@ -532,7 +532,7 @@
     <w:p/>
     <w:p>
       <w:r>
-        <w:t>Pip hatte den Boden entlang der Sockelleisten der Tresen inspiziert. Nun kam sie herüber und schmiegte sich an Gretas Fußknöchel, was sie sonst fast nie bei jemand anderem als mir tat. Greta blickte an sich herab, und etwas von der Steifheit wich aus ihren Schultern.</w:t>
+        <w:t xml:space="preserve">Pip hatte den Boden entlang der Sockelleisten der Tresen inspiziert. Nun kam sie herüber und schmiegte sich an Gretas Fußknöchel, was sie sonst fast nie bei jemand anderem als mir tat. Greta blickte zu ihr hinunter, und etwas von der Steifheit wich aus ihren Schultern.</w:t>
       </w:r>
     </w:p>
     <w:p/>
@@ -550,7 +550,7 @@
     <w:p/>
     <w:p>
       <w:r>
-        <w:t>»Gestern Mittag. Das erste schlechte Blech kam heraus, und ich dachte mir, nun ja, Greta, du warst unvorsichtig, jeder ist mal unvorsichtig. Ich habe es weggeworfen und von vorn begonnen, und es ist wieder passiert. Seitdem laufe ich mir die Hacken wund, während die Thanksgiving-Bestellungen in diesem Buch stehen.«</w:t>
+        <w:t xml:space="preserve">»Gestern Mittag. Das erste schlechte Blech kam heraus, und ich dachte mir, nun ja, Greta, du warst unvorsichtig, jeder ist mal unvorsichtig. Ich habe es weggeworfen und von vorn begonnen, und es ist wieder passiert. Seitdem drehe ich mich im Kreis, während die Thanksgiving-Bestellungen in diesem Buch stehen.«</w:t>
       </w:r>
     </w:p>
     <w:p/>
@@ -592,7 +592,7 @@
     <w:p/>
     <w:p>
       <w:r>
-        <w:t>Ich stand auf, statt zu antworten. Greta bewahrte ihre Grundzutaten in hohen Behältern entlang der hinteren Wand auf, bei denen jeweils die Schaufel an einem Nagel darüber hing. Ich hob den Deckel des Mehlbehälters ab. Es sah aus wie Mehl, fein und blass. Ein wenig war an der Seite auf die Fliesen darunter gesunken, wo es jemand in der Eile verschüttet hatte.</w:t>
+        <w:t xml:space="preserve">Ich stand auf, statt zu antworten. Greta bewahrte ihre Grundzutaten in hohen Behältern entlang der hinteren Wand auf, bei denen jeweils die Schaufel an einem Nagel darüber hing. Ich hob den Deckel des Mehlbehälters ab. Es sah aus wie Mehl, fein und blass. Ein wenig war an der Seite hinunter auf die Fliesen gerieselt, wo es jemand in der Eile verschüttet hatte.</w:t>
       </w:r>
     </w:p>
     <w:p/>
@@ -684,7 +684,7 @@
     </w:p>
     <w:p>
       <w:r>
-        <w:t>»Du hast es gesehen«, sagte sie. Es war keine Frage. »Vorbei an der Apotheke. Sie haben das Schild angebracht.«</w:t>
+        <w:t xml:space="preserve">»Du hast es gesehen«, sagte sie. Es war keine Frage. »Hinter der Apotheke. Sie haben das Schild angebracht.«</w:t>
       </w:r>
     </w:p>
     <w:p>
@@ -1133,7 +1133,7 @@
     </w:p>
     <w:p>
       <w:r>
-        <w:t>Ein kaputtes Fenster kostete Geld, und man konnte es reparieren. Greta würde Ende der Woche wieder Glas haben. Aber wer in der Nacht gekommen war, hatte beim Glas nicht haltgemacht: Sie hatten für jeden, der vorbeiging und es auf der Avenue lesen konnte, hingeschrieben, dass ihr Essen dreckig und ihr Laden eine Gefahr sei. Und eine Bäckerei, wie Renée zwei Tage zuvor auf dem Gehweg vor ihrem neuen Laden zu mir gesagt hatte, lebt von ihrem Namen.</w:t>
+        <w:t xml:space="preserve">Ein kaputtes Fenster kostete Geld, und man konnte es reparieren. Greta würde Ende der Woche wieder Glas haben. Aber wer in der Nacht gekommen war, hatte beim Glas nicht haltgemacht, sondern für jeden, der auf der Avenue vorbeiging, hingeschrieben, dass ihr Essen dreckig und ihr Laden eine Gefahr sei. Und eine Bäckerei, wie Renée zwei Tage zuvor auf dem Gehweg vor ihrem neuen Laden zu mir gesagt hatte, lebt von ihrem Namen.</w:t>
       </w:r>
     </w:p>
     <w:p>
@@ -1158,7 +1158,7 @@
     </w:p>
     <w:p>
       <w:r>
-        <w:t>Ich hatte keine Antwort darauf. Ich hatte dieselbe Frage und noch eine weitere im Kopf, die darunterlag. Aus purem Groll hätte jemand etwas Persönliches geschrieben, einen Fluch oder einen Namen. Wer auch immer DRECKIG und GEFÄHRLICH und ESST HIER NICHT geschrieben hatte, wandte sich an Gretas Kundschaft und versuchte, das Geschäft der Stadt von ihrem Block wegzulocken. Es war zu vage, um es ihr an ihrem schlimmsten Tag überhaupt an den Kopf zu werfen, aber ich war mir sicher. Das war gezielt gewesen, und wer immer es darauf abgesehen hatte, wollte etwas Bestimmtes erreichen.</w:t>
+        <w:t xml:space="preserve">Ich hatte keine Antwort darauf. Ich hatte dieselbe Frage und noch eine weitere im Kopf, die darunterlag. Aus purem Groll hätte jemand etwas Persönliches geschrieben, einen Fluch oder einen Namen. Wer auch immer DRECKIG und GEFÄHRLICH und ESST HIER NICHT geschrieben hatte, wandte sich an Gretas Kundschaft und versuchte, das Geschäft der Stadt von ihrem Block wegzulocken. Es war zu vage, um es ihr an ihrem schlimmsten Tag überhaupt zu sagen, aber ich war mir sicher. Das war gezielt gewesen, und wer immer es darauf abgesehen hatte, wollte etwas Bestimmtes erreichen.</w:t>
       </w:r>
     </w:p>
     <w:p>
@@ -1348,7 +1348,7 @@
     </w:p>
     <w:p>
       <w:r>
-        <w:t>»Wie hat sie gegessen?«, fragte sie mich, ohne aufzublicken.</w:t>
+        <w:t xml:space="preserve">»Isst sie denn ordentlich?«, fragte sie mich, ohne aufzublicken.</w:t>
       </w:r>
     </w:p>
     <w:p>
@@ -1465,7 +1465,7 @@
     <w:p/>
     <w:p>
       <w:r>
-        <w:t>»Dann haben sie sich getrennt«, fuhr Dot fort. »Vor fünfundzwanzig Jahren. So ungefähr. Greta hat sie ausgekauft. Es gab jede Menge böses Blut wegen des Gebäudes und des Namens und wessen Kuchen das nun eigentlich war.«</w:t>
+        <w:t xml:space="preserve">»Dann haben sie sich getrennt«, fuhr Dot fort. »Vor fünfundzwanzig Jahren. So ungefähr. Greta hat sie ausbezahlt. Es gab jede Menge böses Blut wegen des Gebäudes und des Namens und wessen Kuchen das nun eigentlich war.«</w:t>
       </w:r>
     </w:p>
     <w:p/>
@@ -1549,7 +1549,7 @@
     <w:p/>
     <w:p>
       <w:r>
-        <w:t>»Das ist er«, gab Ivy zu, nicht gerade glücklich darüber. »Tom hat es mir selbst erzählt. Pete hat erst vor gut einer Woche ein zweites Vorhängeschloss bei ihm gekauft. Er meinte, Gretas Schloss würde dauernd von der Kette fliegen.« Sie drehte ihren Kranz in den Händen. »Aber das ist ein Mann, der ein Tor abschließt, habe ich mir gesagt. Kein Mann, der einen Ziegelstein wirft.«</w:t>
+        <w:t xml:space="preserve">»Das stimmt«, gab Ivy zu, nicht gerade glücklich darüber. »Tom hat es mir selbst erzählt. Pete hat erst vor gut einer Woche ein zweites Vorhängeschloss bei ihm gekauft. Er meinte, Gretas Schloss würde dauernd von der Kette fliegen.« Sie drehte ihren Kranz in den Händen. »Aber das ist ein Mann, der ein Tor abschließt, habe ich mir gesagt. Kein Mann, der einen Ziegelstein wirft.«</w:t>
       </w:r>
     </w:p>
     <w:p/>
@@ -1573,7 +1573,7 @@
     <w:p/>
     <w:p>
       <w:r>
-        <w:t>»Niemanden, der freundlich ist«, sagte Ellie bedrückt. »Ich habe es mittags im Krankenhaus aufgeschnappt. Mir hat das gar nicht gefallen. Irgendjemand hat gesagt – und ich sage nicht wer –, dass bei den harten Zeiten in diesem Winter und den angespannten Kassen vielleicht jemand Verzweifeltes dahintersteckt. Jemand, der in eine so miese Lage geraten ist, um …« Sie stockte.</w:t>
+        <w:t xml:space="preserve">»Nichts Nettes«, sagte Ellie bedrückt. »Ich habe es mittags im Krankenhaus aufgeschnappt. Mir hat das gar nicht gefallen. Irgendjemand hat gesagt – und ich sage nicht wer –, dass bei den harten Zeiten in diesem Winter und den angespannten Kassen vielleicht jemand Verzweifeltes dahintersteckt. Jemand, dem es schlecht genug geht, um …« Sie stockte.</w:t>
       </w:r>
     </w:p>
     <w:p/>
@@ -1585,7 +1585,7 @@
     <w:p/>
     <w:p>
       <w:r>
-        <w:t>»Ich verabscheue diese Version«, sagte Ivy leise. »Die ist mir am meisten zuwider. Wir wissen doch alle, dass es Familien gibt, die diesen November hart zu kämpfen haben. Hal füllt seine Fässer schließlich auch nicht aus Spaß. Und es ist grausam, einen Nachbarn anzusehen, der friert und mit der Ölrechnung im Rückstand ist, und zu denken: Da haben wir deinen Steinewerfer.«</w:t>
+        <w:t xml:space="preserve">»Ich verabscheue diese Version«, sagte Ivy leise. »Die ist mir am meisten zuwider. Wir wissen doch alle, dass es Familien gibt, die diesen November hart zu kämpfen haben. Hal füllt seine Fässer schließlich auch nicht aus Spaß. Und es ist grausam, einen Nachbarn anzusehen, der friert und mit der Ölrechnung im Rückstand ist, und zu denken: Da haben wir ja unseren Steinewerfer.«</w:t>
       </w:r>
     </w:p>
     <w:p/>
@@ -1752,7 +1752,7 @@
     <w:p/>
     <w:p>
       <w:r>
-        <w:t>Er hörte mich erst nicht. Er hatte eine alte Zeichnung in einem rissigen Rahmen vor sich und zog sie mit einer Sorgfalt auseinander, die mich überraschte, selbst als ich wusste, was ich von ihm wusste. Jeder kleine Drahtstift wurde eher mit einem Uhrmacherschraubenzieher herausgedreht als herausgezwungen. Ein Holztablett an seinem Ellbogen hielt hundert solcher kleinen Handgriffe bereit: Drahtstifte, Eckenschutzstücke, säurefreie Papierstreifen auf Maß geschnitten. Er flickte den Verein einen Drahtstift nach dem anderen, mit dem geduldigen, gebeugten Blick eines Mannes, der wusste, wie lange das dauern würde, und seinen Frieden mit dieser Länge gemacht hatte.</w:t>
+        <w:t xml:space="preserve">Er hörte mich erst nicht. Er hatte eine alte Zeichnung in einem rissigen Rahmen vor sich und zog sie mit einer Sorgfalt auseinander, die mich überraschte, obwohl ich wusste, was ich von ihm wusste. Jeder kleine Drahtstift wurde eher mit einem Uhrmacherschraubenzieher herausgedreht als herausgezwungen. Ein Holztablett an seinem Ellbogen hielt hundert solcher kleinen Handgriffe bereit: Drahtstifte, Eckenschutzstücke, säurefreie Papierstreifen auf Maß geschnitten. Er flickte den Verein einen Drahtstift nach dem anderen, mit dem geduldigen, gebeugten Blick eines Mannes, der wusste, wie lange das dauern würde, und seinen Frieden mit dieser Länge gemacht hatte.</w:t>
       </w:r>
     </w:p>
     <w:p/>
@@ -1776,7 +1776,7 @@
     <w:p/>
     <w:p>
       <w:r>
-        <w:t>»Du hast jetzt das Ohr eines Hausmeisters, nicht mehr das eines Ladenbesitzers.« Ich stellte das Shortbread auf die einzige Ecke des Tischs, die nicht von der Arbeit beansprucht wurde. »Ich habe dir das mitgebracht. Gretas Rezept, meine Hände. Urteile also nicht nach ihnen über sie.«</w:t>
+        <w:t xml:space="preserve">»Du hast jetzt das Ohr eines Hausmeisters, nicht mehr das eines Ladenbesitzers.« Ich stellte das Shortbread auf die einzige Ecke des Tischs, die nicht von der Arbeit beansprucht wurde. »Ich habe dir das mitgebracht. Gretas Rezept, meine Hände. Beurteile sie also nicht danach.«</w:t>
       </w:r>
     </w:p>
     <w:p/>
@@ -1896,7 +1896,7 @@
     <w:p/>
     <w:p>
       <w:r>
-        <w:t xml:space="preserve">Ich hatte sie seither nicht mehr direkt angesehen. Es war keine einfache Schachtel, die man direkt ansehen konnte, bei dem, was sie in sich trug und was sie für diese Stadt bedeutete nach dem Herbst, den wir alle hinter uns hatten, nachdem sie Ende Oktober aus der kalten Erde unter dem Anger aufgetaucht war, versiegelt für hundert Jahre und mehr. Niemand hatte sie im rohen Schmerz der Jahreszeit, in der sie gefunden wurde, aufgerissen. Stattdessen hatten sie sie hier hinter sauberem Glas aufgestellt, bis zum neuen Jahr. Eine handbeschriftete Karte lehnte dagegen. </w:t>
+        <w:t xml:space="preserve">Ich hatte sie seit meiner Ankunft nicht direkt angesehen. Es war keine einfache Schachtel, die man direkt ansehen konnte, bei dem, was sie in sich trug und was sie für diese Stadt bedeutete nach dem Herbst, den wir alle hinter uns hatten, nachdem sie Ende Oktober aus der kalten Erde unter dem Anger aufgetaucht war, versiegelt für hundert Jahre und mehr. Niemand hatte sie im rohen Schmerz der Jahreszeit, in der sie gefunden wurde, aufgerissen. Stattdessen hatten sie sie hier hinter sauberem Glas aufgestellt, bis zum neuen Jahr. Eine handbeschriftete Karte lehnte dagegen. </w:t>
       </w:r>
       <w:r>
         <w:rPr>
@@ -2036,7 +2036,7 @@
     <w:p/>
     <w:p>
       <w:r>
-        <w:t>Petes Metzgerei lag auf der anderen Seite des Angers, gegenüber der Evergreen Avenue, in der Ladenzeile, die dem Anger von der anderen Seite her zugewandt war. Ich ging auf dem geräumten Weg am Kriegerdenkmal vorbei hinüber. Sein Fleisch wurde durch den Hof hinter den Geschäften der Evergreen Avenue angeliefert, demselben Hof, durch den auch Gretas Mehl kam. Ich hatte mir, bis ich auf seiner Fußmatte stand, während die Glocke oben noch schwang, nicht richtig überlegt, wie dieser eine Hof seinen Ärger mit ihrem verband. Im Laden war es warm. Es roch nach kaltem, frischem Fleisch und Sägemehl und darunter nach jenem schwachen Eisenhauch, der in allen Metzgereien lag, egal wie geschrubbt sie waren. Pete stand hinter seiner Theke in seiner gestreiften Schürze, breit und mit salz-und-pfefferfarbenen Schläfen. Er zerlegte gerade ein Teilstück mit den kurzen, sparsamen Bewegungen eines Mannes, der das schon vierzigtausend Mal getan hatte. Er blickte zu der Glocke auf, sah, dass ich es war, und sein Gesicht wurde wachsam. Es war der Blick eines Mannes, der in letzter Zeit herausgefunden hatte, dass die Leute durch seine Tür dazu neigten, immer dasselbe Eine von ihm zu wollen.</w:t>
+        <w:t xml:space="preserve">Petes Metzgerei lag auf der anderen Seite des Angers, gegenüber der Evergreen Avenue, in der Ladenzeile, die dem Anger von der anderen Seite her zugewandt war. Ich ging auf dem geräumten Weg am Kriegerdenkmal vorbei hinüber. Sein Fleisch wurde durch den Hof hinter den Geschäften der Evergreen Avenue angeliefert, demselben Hof, durch den auch Gretas Mehl kam. Ich hatte mir, bis ich auf seiner Fußmatte stand, während die Glocke oben noch schwang, nicht richtig überlegt, wie dieser eine Hof seinen Ärger mit ihrem verband. Im Laden war es warm. Es roch nach kaltem, frischem Fleisch und Sägemehl und darunter nach jenem schwachen Eisenhauch, der in allen Metzgereien lag, egal wie geschrubbt sie waren. Pete stand hinter seiner Theke in seiner gestreiften Schürze, breit und mit salz-und-pfefferfarbenen Schläfen. Er zerlegte gerade ein Teilstück mit den kurzen, sparsamen Bewegungen eines Mannes, der das schon vierzigtausend Mal getan hatte. Er blickte zu der Glocke auf, sah, dass ich es war, und sein Gesicht wurde wachsam. Es war der Blick eines Mannes, der in letzter Zeit herausgefunden hatte, dass die Leute, die zu ihm hereinkamen, immer dasselbe Eine von ihm wollten.</w:t>
       </w:r>
     </w:p>
     <w:p/>
@@ -2054,7 +2054,7 @@
     <w:p/>
     <w:p>
       <w:r>
-        <w:t>Das traf ihn dort, wo ich gezielt hatte, und Petes Gesicht entspannte sich zu der schlichten Freude an seinem Handwerk. Er kam um die Theke herum und wog eine marmorierte Rinderhüfte gegen das Rinderbugstück daneben ab, ehrlich wie eine Waage. Dann lenkte er mich zu dem billigeren Stück hin, weil es seinen Zweck besser erfüllte und er mir nichts Teures verkaufen wollte, wenn billig richtig war. Pip, die mir auf dem Fuß gefolgt war und ihre Runde im Sägemehl gedreht hatte, für den Fall, dass etwas Pinguin-Würdiges übrig geblieben war, fand die Einrichtung traurig gefegt. Sie stand mit der Miene einer Kundin, die vom Service enttäuscht war, am Tresen.</w:t>
+        <w:t xml:space="preserve">Das traf ihn dort, wo ich gezielt hatte, und Petes Gesicht entspannte sich zu der schlichten Freude an seinem Handwerk. Er kam um die Theke herum und wog eine marmorierte Rinderhüfte gegen das Rinderbugstück daneben ab, ehrlich wie eine Waage. Dann lenkte er mich zu dem billigeren Stück hin, weil es seinen Zweck besser erfüllte und er mir nichts Teures verkaufen wollte, wenn billig richtig war. Pip, die mir auf dem Fuß gefolgt war und ihre Runde im Sägemehl gedreht hatte, für den Fall, dass etwas Pinguin-Würdiges übrig geblieben war, fand den Laden zu ihrem Bedauern sauber gefegt. Sie stand mit der Miene einer Kundin, die vom Service enttäuscht war, am Tresen.</w:t>
       </w:r>
     </w:p>
     <w:p/>
@@ -2096,13 +2096,13 @@
     <w:p/>
     <w:p>
       <w:r>
-        <w:t>»Ich habe es benennen hören«, sagte ich, vorsichtig und wahrhaftig. »Ich habe mich noch nicht sagen hören, dass ich ihm zustimme.«</w:t>
-      </w:r>
-    </w:p>
-    <w:p/>
-    <w:p>
-      <w:r>
-        <w:t>»Das ist mehr, als sich die meisten die Mühe gemacht haben.« Er drehte den Braten und fing eine neue Schlaufe an. »Ich erzähle Ihnen nicht, dass Greta und ich Freunde sind. Das sind wir nicht, und ich lasse mich von Ihnen später nicht dabei ertappen. Dieser Hof ist für einen Lkw gebaut und wir sind zu zweit, die ihn wollen. Und ja, ich habe im Juli das Tor angekettet, und ja, sie hat die Stadt auf mich gehetzt, und ja«, sein Kiefer arbeitete, »ich habe etwas über ihre Mülltonnen und die Ratten gesagt, das ich nicht noch einmal sagen würde und von vornherein nicht hätte sagen sollen, und sie kriegt eine Entschuldigung, wenn ich weniger Wut im Bauch habe und nicht vorher.« Er zog an dem Knoten. »Das ist die Wahrheit daran, und sie ist hässlich genug. Aber es ist eine Wahrheit über eine Laderampe. Sie ist keine Wahrheit über einen Backstein durch ein Fenster.«</w:t>
+        <w:t xml:space="preserve">»Ich habe den Namen fallen hören«, sagte ich, vorsichtig und wahrhaftig. »Ich habe mich noch nicht sagen hören, dass ich ihm zustimme.«</w:t>
+      </w:r>
+    </w:p>
+    <w:p/>
+    <w:p>
+      <w:r>
+        <w:t xml:space="preserve">»Damit sind Sie schon gründlicher als die meisten.« Er drehte den Braten und fing eine neue Schlaufe an. »Ich erzähle Ihnen nicht, dass Greta und ich Freunde sind. Das sind wir nicht, und ich lasse mich von Ihnen später nicht dabei ertappen. Dieser Hof ist für einen Lkw gebaut und wir sind zu zweit, die ihn wollen. Und ja, ich habe im Juli das Tor angekettet, und ja, sie hat die Stadt auf mich gehetzt, und ja«, sein Kiefer arbeitete, »ich habe etwas über ihre Mülltonnen und die Ratten gesagt, das ich nicht noch einmal sagen würde und von vornherein nicht hätte sagen sollen, und sie kriegt eine Entschuldigung, wenn ich weniger Wut im Bauch habe und nicht vorher.« Er zog an dem Knoten. »Das ist die Wahrheit daran, und sie ist hässlich genug. Aber es ist eine Wahrheit über eine Laderampe. Sie ist keine Wahrheit über einen Backstein durch ein Fenster.«</w:t>
       </w:r>
     </w:p>
     <w:p/>
@@ -2120,7 +2120,7 @@
     <w:p/>
     <w:p>
       <w:r>
-        <w:t>»Tom erzählt mir, Sie seien zu ungewöhnlichen Zeiten unten in der Gasse gewesen«, sagte ich, beiläufig, als wäre es mehr Ladengespräch. »Vorhängeschlösser bei ihm kaufen, als würden die aus der Mode kommen.«</w:t>
+        <w:t xml:space="preserve">»Tom erzählt mir, Sie seien zu ungewöhnlichen Zeiten unten in der Gasse gewesen«, sagte ich, beiläufig, als wäre es mehr Ladengespräch. »Vorhängeschlösser bei ihm kaufen, als gäbe es bald keine mehr.«</w:t>
       </w:r>
     </w:p>
     <w:p/>
@@ -2156,7 +2156,7 @@
     <w:p/>
     <w:p>
       <w:r>
-        <w:t>»Ich sage Ihnen was«, sagte er, nun leiser, der Groll war aus seiner Stimme gewichen, »und Sie können davon halten, was Sie wollen, weil ich selbst nicht viel davon halten kann. An diesen Morgen, an denen ich im Dunkeln unten auf dem Hof bin, bin ich nicht der Einzige dort unten gewesen.« Er drehte den Kopf zu seinem Schaufenster und den Ladenlokalen der Evergreen Avenue auf der anderen Seite des Angers, der Hof dahinter außer Sicht. »Da war jemand hinten an ihrem Laden. Frühmorgens, bevor es hell genug ist, um ein Gesicht zu sehen, nur eine Gestalt, und schnell weg, wenn meine Scheinwerfer um die Ecke kommen. Zweimal habe ich es gesehen. Vielleicht dreimal. Jemand, wo um diese Stunde niemand sein sollte, dicht an ihrer Hintertür, und dann weg.« Er blickte stirnrunzelnd auf seine Hände herab. »Ich hielt es das erste Mal für einen Streuner, jemanden, der es auf die Wärme ihrer Lüftungsschächte abgesehen hatte. Aber ein Streuner lässt sich nieder, und dieser tat es nicht. Dieser tat etwas. Und ging, als er gesehen wurde. An einem dieser Morgen gab es einen Lieferwagen, den ich nicht kannte, am hinteren Ende bei der Apotheke geparkt, mit ausgeschalteten Lichtern. Nicht der vom Fleischwagen. Auswärtiges Kennzeichen; ich habe es nicht mitbekommen.«</w:t>
+        <w:t xml:space="preserve">»Ich sage Ihnen was«, sagte er, nun leiser, der Groll war aus seiner Stimme gewichen, »und Sie können daraus machen, was Sie wollen, denn ich selbst werde nicht schlau daraus. An diesen Morgen, an denen ich im Dunkeln unten auf dem Hof bin, bin ich nicht der Einzige dort unten gewesen.« Er drehte den Kopf zu seinem Schaufenster und den Ladenlokalen der Evergreen Avenue auf der anderen Seite des Angers, der Hof dahinter außer Sicht. »Da war jemand hinten an ihrem Laden. Frühmorgens, bevor es hell genug ist, um ein Gesicht zu sehen, nur eine Gestalt, und schnell weg, wenn meine Scheinwerfer um die Ecke kommen. Zweimal habe ich es gesehen. Vielleicht dreimal. Jemand, wo um diese Stunde niemand sein sollte, dicht an ihrer Hintertür, und dann weg.« Er blickte stirnrunzelnd auf seine Hände herab. »Ich hielt es das erste Mal für einen Streuner, jemanden, der es auf die Wärme ihrer Lüftungsschächte abgesehen hatte. Aber ein Streuner lässt sich nieder, und diese Gestalt tat es nicht. Sie tat etwas. Und verschwand, sobald man sie sah. An einem dieser Morgen gab es einen Lieferwagen, den ich nicht kannte, am hinteren Ende bei der Apotheke geparkt, mit ausgeschalteten Lichtern. Nicht der vom Fleischwagen. Auswärtiges Kennzeichen; ich habe es nicht mitbekommen.«</w:t>
       </w:r>
     </w:p>
     <w:p/>
@@ -2189,7 +2189,7 @@
     <w:p/>
     <w:p>
       <w:r>
-        <w:t>»Es müsste Fußabdrücke geben«, sagte ich, halb zu mir selbst, während ich den Schnee dieses Hofes in meinem Geist sah, fünfzehn Zentimeter hoch, sauber daliegend wie überall sonst um diese Zeit im Monat. »Wenn jemand im Dunkeln an ihrer Hintertür gestanden hat, hätte er Fußabdrücke hinterlassen.«</w:t>
+        <w:t xml:space="preserve">»Es müsste Fußabdrücke geben«, sagte ich, halb zu mir selbst, während ich den Schnee dieses Hofes in meinem Geist sah, fünfzehn Zentimeter hoch, sauber daliegend wie überall sonst um diese Zeit im Monat. »Wenn jemand im Dunkeln an ihrer Hintertür gestanden hat, müssten Fußabdrücke zurückgeblieben sein.«</w:t>
       </w:r>
     </w:p>
     <w:p/>
@@ -2219,7 +2219,7 @@
     <w:p/>
     <w:p>
       <w:r>
-        <w:t>»Nein«, sagte ich. »Das ist es nicht. Ist mir aufgefallen.«</w:t>
+        <w:t xml:space="preserve">»Nein«, sagte ich. »Wirklich nicht. Ist mir aufgefallen.«</w:t>
       </w:r>
     </w:p>
     <w:p/>
@@ -2299,7 +2299,7 @@
     </w:p>
     <w:p>
       <w:r>
-        <w:t>Das waren sie tatsächlich. Es gab kein anderes ehrliches Wort dafür. Ich stand am oberen Ende der Evergreen Avenue, Pip an meiner Seite, umringt von einer wachsenden Menschenmenge, die sich die ganze Straße entlangstaute. Und selbst ich, die ich die Hand kannte, die das getan hatte, so gut wie meine eigene, hielt den Atem an angesichts dieser puren, beglückenden Narretei.</w:t>
+        <w:t xml:space="preserve">Und so war es tatsächlich. Es gab kein anderes ehrliches Wort dafür. Ich stand am oberen Ende der Evergreen Avenue, Pip an meiner Seite, umringt von einer wachsenden Menschenmenge, die sich die ganze Straße entlangstaute. Und selbst ich, die ich die Hand kannte, die das getan hatte, so gut wie meine eigene, hielt den Atem an angesichts dieser puren, beglückenden Narretei.</w:t>
       </w:r>
     </w:p>
     <w:p>
@@ -2374,7 +2374,7 @@
     </w:p>
     <w:p>
       <w:r>
-        <w:t>Pip sah ihn ebenfalls an, und ihre Federn sträubten sich an ihrem Hals, genau wie damals bei Gretas Mehlbehälter. Sie ging nicht auf ihn zu. Ich auch nicht. Ich legte ihn in meinem Kopf beiseite, diesen einen, der quer zu all den anderen Dingen stand und sich nicht dorthin neigen wollte wie seine Gefährten. Ein Schneemann, der fehl am Platz an einer Gasse stand. Ich hätte dir nicht sagen können, was das zu bedeuten hatte, nur, dass er nicht zu dem restlichen Wunder gehörte.</w:t>
+        <w:t xml:space="preserve">Pip sah ihn ebenfalls an, und ihre Federn sträubten sich an ihrem Hals, genau wie damals bei Gretas Mehlbehälter. Sie ging nicht auf ihn zu. Ich auch nicht. Ich legte ihn in meinem Kopf beiseite, diesen einen, der quer zu all den anderen Dingen stand und sich nicht dorthin neigen wollte wie seine Gefährten. Ein Schneemann, der fehl am Platz an einer Gasse stand. Ich hätte nicht sagen können, was das zu bedeuten hatte, nur, dass er nicht zu dem restlichen Wunder gehörte.</w:t>
       </w:r>
     </w:p>
     <w:p>
@@ -2396,7 +2396,7 @@
     </w:p>
     <w:p>
       <w:r>
-        <w:t>»Alle. Auf dem Anger versammelt, hierher geneigt. Keine Spuren.« Ich stampfte den Schnee auf seiner Stufe ab. »Die Stadt hat beschlossen, dass es die Kinder und das Tauwetter waren. Sie trinken draußen Kellys Kaffee und haben eine wunderbare Zeit, ohne darüber nachzudenken. Nick. Sie sind gegangen.«</w:t>
+        <w:t xml:space="preserve">»Alle. Auf dem Anger versammelt, hierher geneigt. Keine Spuren.« Ich stampfte den Schnee auf seiner Stufe ab. »Die Stadt hat beschlossen, dass es die Kinder und das Tauwetter waren. Sie trinken draußen Kellys Kaffee und haben eine wunderbare Zeit, ohne darüber nachzudenken. Nick. Sie sind gewandert.«</w:t>
       </w:r>
     </w:p>
     <w:p>
@@ -2426,7 +2426,7 @@
     </w:p>
     <w:p>
       <w:r>
-        <w:t>»Das ist das Zuhause, das ich für sie baue, damit sie sich nicht länger die Schneemänner ausleiht.« Ein müdes, echtes Lächeln. »Es ist noch nicht so weit. Es dauert noch Jahre, bis alles fertig ist. Aber es ist ein Anfang, und bis es vollbracht ist, wird sie weiterhin Kerzen golden anstrahlen und die Schneemänner der Kinder im Dunkeln herumspazieren lassen, weil sie hier sein will und keine eigenen Beine besitzt. Bram ist völlig aus dem Häuschen. Findet es unwürdig, dass Magie sich in der Öffentlichkeit so aufführt, dass die Stadt es sehen kann. Am liebsten würde er sie mit den Rentieren auf der Koppel einsperren, und hätte ungefähr so viel Glück dabei, sie dort festzuhalten.«</w:t>
+        <w:t xml:space="preserve">»Das ist das Zuhause, das ich für sie baue, damit sie sich nicht länger die Schneemänner ausleiht.« Ein müdes, echtes Lächeln. »Es ist noch nicht so weit. Es dauert noch Jahre, bis alles fertig ist. Aber es ist ein Anfang, und bis es vollbracht ist, wird sie weiterhin Kerzen golden färben und die Schneemänner der Kinder im Dunkeln herumspazieren lassen, weil sie hier sein will und keine eigenen Beine besitzt. Bram ist völlig aus dem Häuschen. Findet es unwürdig, dass Magie sich in der Öffentlichkeit so aufführt, dass die Stadt es sehen kann. Am liebsten würde er sie mit den Rentieren auf der Koppel einsperren, und hätte ungefähr so viel Glück dabei, sie dort festzuhalten.«</w:t>
       </w:r>
     </w:p>
     <w:p>
@@ -2463,12 +2463,12 @@
     </w:p>
     <w:p>
       <w:r>
-        <w:t>»Ich weiß«, sagte ich zu ihr, leiser als beabsichtigt. »Sie versucht mir etwas zu sagen. Ich kann es nur noch nicht lesen.«</w:t>
-      </w:r>
-    </w:p>
-    <w:p>
-      <w:r>
-        <w:t>Ich machte auf dem Absatz kehrt und ging im hereinbrechenden Dunkel nach Hause, mit der ganzen warmen Stadt hinter mir, einem kalten Schneemann, der in die andere Richtung neigte, und der Magie um mich herum, die von einer so wortlosen, dringenden Zärtlichkeit erfüllt war, die sie nicht buchstabieren konnte und die ich für sie noch nicht zu buchstabieren vermochte. Halbwegs die Straße herauf blieb Pip stehen, warf noch einen Blick zurück auf den Schneemann und beeilte sich dann, wieder zu mir aufzuschließen.</w:t>
+        <w:t xml:space="preserve">»Ich weiß«, sagte ich zu ihr, leiser als beabsichtigt. »Er versucht, mir etwas zu sagen. Ich kann es nur noch nicht lesen.«</w:t>
+      </w:r>
+    </w:p>
+    <w:p>
+      <w:r>
+        <w:t xml:space="preserve">Ich machte auf dem Absatz kehrt und ging im hereinbrechenden Dunkel nach Hause, mit der ganzen warmen Stadt hinter mir, einem kalten Schneemann, der in die andere Richtung neigte, und der Magie um mich herum, die von einer wortlosen, dringenden Zärtlichkeit erfüllt war, die sie nicht buchstabieren konnte und die ich für sie noch nicht zu buchstabieren vermochte. Halbwegs die Straße herauf blieb Pip stehen, warf noch einen Blick zurück auf den Schneemann und beeilte sich dann, wieder zu mir aufzuschließen.</w:t>
       </w:r>
     </w:p>
     <w:p>
@@ -2614,7 +2614,7 @@
         <w:t>Es riecht komisch. Ich habe eine Maus gesehen. Mein Brötchen war innen noch roh.</w:t>
       </w:r>
       <w:r>
-        <w:t xml:space="preserve"> Gefühlssache, meistens, die Hälfte davon pure Gehässigkeit, und ich sortiere die Gehässigkeit auf der Fußmatte aus, bevor ich meine Tasche aufmache.« Er setzte seinen Hut gerade. »Diese hier las sich nicht so. Sie kam mit der Schreibmaschine getippt und nannte die Unterparagraphen. Sie nannte mir den genauen Paragraphen für die Handwaschbecken-Temperatur, Kapitel und Abschnitt. Sie benannte den Fugenmörtel und den Spalt an der Tür in den Fachbegriffen, noch bevor ich einen Fuß hineingesetzt hatte, als würde sie eine Checkliste aus meinem Handbuch ablesen. Sie nannte die Kühlzelle ›den Kühlraum‹, als wäre es ein Eigenname, und das Handwaschbecken ›das Hobart-Becken‹. Wer immer das geschrieben hat, wusste, wofür eine gewerbliche Küche aufgeschrieben wird, wusste es aus dem Effeff und kannte genau die Stellen, an denen ein altes Gebäude morsch ist.« Er öffnete die Tür zur Kälte. »Jemand, der das Regelwerk so gut kennt, ist normalerweise nicht derjenige, der die Beschwerde einreicht. Die haben für gewöhnlich ihre eigene Küche im Auge.«</w:t>
+        <w:t xml:space="preserve"> Gefühlssache, meistens, die Hälfte davon pure Gehässigkeit, und ich sortiere die Gehässigkeit auf der Fußmatte aus, bevor ich meine Tasche aufmache.« Er setzte seinen Hut gerade. »Diese hier las sich nicht so. Sie kam mit der Schreibmaschine getippt und nannte die Unterparagraphen. Sie nannte mir den genauen Paragraphen für die Handwaschbecken-Temperatur, Kapitel und Abschnitt. Sie benannte den Fugenmörtel und den Spalt an der Tür in den Fachbegriffen, noch bevor ich einen Fuß hineingesetzt hatte, als würde sie eine Checkliste aus meinem Handbuch ablesen. Sie nannte die Kühlzelle ›den Kühlraum‹, als wäre es ein Eigenname, und das Handwaschbecken ›das Hobart-Becken‹. Wer immer das geschrieben hat, wusste, wofür eine gewerbliche Küche aufgeschrieben wird, wusste es aus dem Effeff und kannte genau die Stellen, an denen ein altes Gebäude morsch ist.« Er öffnete die Tür zur Kälte. »Jemand, der das Regelwerk so gut kennt, reicht normalerweise keine Beschwerde ein. Die haben für gewöhnlich ihre eigene Küche im Auge.«</w:t>
       </w:r>
     </w:p>
     <w:p/>
@@ -2683,7 +2683,7 @@
     <w:p/>
     <w:p>
       <w:r>
-        <w:t>Greta kam hinter der Vitrine hervor und nahm es ihr wortlos ab. Die junge Frau wartete, als gäbe es vielleicht eine Nachricht zurückzubringen. Als keine kam, sagte sie: »Schön. Einen schönen Abend noch« und ließ sich hinaus.</w:t>
+        <w:t xml:space="preserve">Greta kam hinter der Vitrine hervor und nahm es ihr wortlos ab. Die junge Frau wartete, als gäbe es vielleicht eine Nachricht zurückzubringen. Als keine kam, sagte sie: »Gut. Einen schönen Abend noch« und ließ sich hinaus.</w:t>
       </w:r>
     </w:p>
     <w:p/>
@@ -2774,7 +2774,7 @@
     </w:p>
     <w:p>
       <w:r>
-        <w:t>»Pst.« Er sagte es mit einer leisen Warnung im Tonfall, der Warnung eines umsichtigen Mannes, der eine vorsichtige Geste der Güte beschützte. »Der ganze Sinn des Fasses besteht darin, dass niemand im hellen Schein dastehen und darum bitten muss. Aber jede Woche geht ein Karton an dieses Ende der Stadt, und auf wessen Stufe er landet, geht niemanden etwas an.« Er sah mich an, und die Scheu wich aus ihm. »Du kommst in Häuser hinein, die für den Rest von uns verschlossen bleiben. Wenn du mit eigenen Augen sehen willst, vor welcher Familie sich die Straße diese Woche zu fürchten beschlossen hat, da drüben steht ein Karton, der getragen werden muss, und ich kann es nicht tun. Sie kennen mich.«</w:t>
+        <w:t xml:space="preserve">»Im Stillen.« Er sagte es mit einer leisen Warnung im Tonfall, der Warnung eines umsichtigen Mannes, der eine vorsichtige Geste der Güte beschützte. »Der ganze Sinn des Fasses besteht darin, dass niemand im hellen Schein dastehen und darum bitten muss. Aber jede Woche geht ein Karton an dieses Ende der Stadt, und auf wessen Stufe er landet, geht niemanden etwas an.« Er sah mich an, und die Scheu wich aus ihm. »Du kommst in Häuser hinein, die für den Rest von uns verschlossen bleiben. Wenn du mit eigenen Augen sehen willst, vor welcher Familie sich die Straße diese Woche zu fürchten beschlossen hat, da drüben steht ein Karton, der getragen werden muss, und ich kann es nicht tun. Sie kennen mich.«</w:t>
       </w:r>
     </w:p>
     <w:p>
@@ -2789,7 +2789,7 @@
     </w:p>
     <w:p>
       <w:r>
-        <w:t>Er gab ihn mir, und ich trug ihn den Hügel hinauf, bevor ich mich noch von dem Gang hätte abbringen können. Die Doucettes wohnten am Ende bei der Kirche, wo die Avenue keine Läden mehr hatte und in Wohnhäuser überging. Ein schmales, graues Gebäude mit einer durchhängenden Veranda und einem Ahorn im Vorgarten, dessen Blätter bereits abgefallen waren. Ich wusste schon vor dem Blick auf den Namen am Karton, dass es ihres war, und zwar wegen des Holzstapels. Er war viel zu klein. Eine Familie, die einen harten Winter überstehen will, stapelt ihr Holz bis November unters Dach. Der Stapel der Doucettes war ein kümmerlicher, ärmlicher Haufen unter einer Plane. Zwei Wochen Brennholz, wo es vier Monate sein müssten. Und diesen Monat bereits einmal nach Brennbarem durchsucht.</w:t>
+        <w:t xml:space="preserve">Er gab ihn mir, und ich trug ihn den Hügel hinauf, bevor ich mich noch von dem Gang hätte abbringen können. Die Doucettes wohnten am Ende bei der Kirche, wo die Avenue keine Läden mehr hatte und in Wohnhäuser überging. Ein schmales, graues Gebäude mit einer durchhängenden Veranda und einem Ahorn im Vorgarten, dessen Blätter bereits abgefallen waren. Ich wusste schon vor dem Blick auf den Namen am Karton, dass es ihres war, und zwar wegen des Holzstapels. Er war viel zu klein. Eine Familie, die einen Winter in Neuengland überstehen will, stapelt ihr Holz bis November unters Dach. Der Stapel der Doucettes war ein kümmerlicher, ärmlicher Haufen unter einer Plane. Zwei Wochen Brennholz, wo es vier Monate sein müssten. Und diesen Monat bereits einmal nach Brennbarem durchsucht.</w:t>
       </w:r>
     </w:p>
     <w:p>
@@ -2908,7 +2908,7 @@
     </w:p>
     <w:p>
       <w:r>
-        <w:t>»Ich habe einen sauberen Fußboden vorgefunden. Und eine Frau, die mir Tee kochte, den sie sich eigentlich nicht leisten konnte.« Ich sah zu, wie der Mann mit seinem Jungen den Laden verließ, während die Suppendosen hinter ihnen im Fass verschwanden. »Wer immer das Greta antut, tut es nicht, weil er friert. Sie tun es, weil sie wollen, dass ihr Laden leer bleibt und ihr eigener sich füllt. Das ist keine hungrige Hand. Hunger hätte zugegriffen. Diese hier zielt.«</w:t>
+        <w:t xml:space="preserve">»Ich habe einen sauberen Fußboden vorgefunden. Und eine Frau, die mir Tee kochte, den sie sich eigentlich nicht leisten konnte.« Ich sah zu, wie der Mann mit seinem Jungen den Laden verließ, während die Suppendosen hinter ihnen im Fass verschwanden. »Wer immer Greta das antut, tut es nicht, weil die Kälte ins Haus kriecht. Es geschieht, damit ihr Laden leer bleibt und der eigene sich füllt. Das ist keine hungrige Hand. Hunger hätte zugegriffen. Diese hier zielt.«</w:t>
       </w:r>
     </w:p>
     <w:p>
@@ -2991,7 +2991,7 @@
     <w:p/>
     <w:p>
       <w:r>
-        <w:t>Ich behaupte nicht, dass ich all dem folgen konnte. Er benetzte ein wenig auf einem Objektträger und betrachtete es unter dem Messingmikroskop, das er für Milch benutzte. Er schüttete eine Menge auf die Waage, brannte eine Prise davon in einer Schale an und roch an dem Rauch. Er runzelte die Stirn. Er tat es noch einmal. Dann rührte er eine Prise in ein Schälchen Wasser, legte einen Streifen pH-Papier aus der Blechdose hinein, die er für Tests aufbewahrte, was im Magen einer Kuh vor sich ging, und hielt es gegen das letzte Licht des Fensters. Es färbte sich rot, schnell und vollständig, wo Mehl, das aus einem guten, sauberen Sack geschüttet worden war, es in einem milden Gelb zurückgelassen hätte. Pip saß neben dem Ofen und beobachtete ihn mit schiefgelegtem Kopf, professionell, wie ein Spezialist, der einen anderen beobachtet.</w:t>
+        <w:t xml:space="preserve">Ich behaupte nicht, dass ich all dem folgen konnte. Er benetzte ein wenig auf einem Objektträger und betrachtete es unter dem Messingmikroskop, das er für Milch benutzte. Er schüttete eine abgemessene Menge auf die Waage, brannte eine Prise davon in einer Schale an und roch an dem Rauch. Er runzelte die Stirn. Er tat es noch einmal. Dann rührte er eine Prise in ein Schälchen Wasser, legte einen Streifen pH-Papier aus der Blechdose hinein, mit der er sonst prüfte, was im Magen einer Kuh vor sich ging, und hielt es gegen das letzte Licht des Fensters. Es färbte sich rot, schnell und vollständig, wo Mehl, das aus einem guten, sauberen Sack geschüttet worden war, es in einem milden Gelb zurückgelassen hätte. Pip saß neben dem Ofen und beobachtete ihn mit schiefgelegtem Kopf, professionell, wie ein Spezialist, der einen anderen beobachtet.</w:t>
       </w:r>
     </w:p>
     <w:p>
@@ -3031,7 +3031,7 @@
     </w:p>
     <w:p>
       <w:r>
-        <w:t>»Ich kann nicht in einen fremden Kopf hineinsehen, Jessica. Aber ich kann Ihnen sagen, dass ein Behälter mit gutem Mehl nicht über Nacht und in zehnfacher Dosis das Säuerungsmittel einer Großbäckerei hervorbringt – durch keinen Unfall, den Gott oder das Wetter jemals hervorgebracht haben.« Er schraubte den Deckel auf das Glas und schob es mir über die Bank sanft zurück. »Jemand hat das dorthin getan. Und diejenige Person wusste genau, wie viel sie hineintun musste.«</w:t>
+        <w:t xml:space="preserve">»Ich kann nicht in einen fremden Kopf hineinsehen, Jessica. Aber ich kann Ihnen sagen, dass ein Behälter mit gutem Mehl nicht über Nacht und in zehnfacher Dosis das Säuerungsmittel einer Großbäckerei hervorbringt – durch keinen Unfall, den Gott oder das Wetter jemals hervorgebracht haben.« Er schraubte den Deckel auf das Glas und schob es mir über die Bank sanft zurück. »Jemand hat das dorthin getan. Und wer immer es war, wusste genau, wie viel hineingehörte.«</w:t>
       </w:r>
     </w:p>
     <w:p/>
@@ -3053,7 +3053,7 @@
     </w:p>
     <w:p>
       <w:r>
-        <w:t>Man konnte ein Säuerungsmittel nicht einfach sackweise aus dem Regal eines Krämers kaufen. Es stammte von einem Bäckerzulieferer, über ein Kundenkonto, an Leute, von denen man wusste, dass sie vom Fach waren. Man konnte es auch nicht nach Augenmaß dosieren. Eine Prise zu wenig, und es wirkte nicht. Eine Schaufel zu viel, und das rohe Mehl roch scharf, sobald der Sack geöffnet wurde, und jeder Bäcker warf den Sack weg. Sie zu ruinieren und das Mehl so gesund aussehen und riechen zu lassen, dass sie es viermal backen würde, viermal in sauberen Chargen und mit einem frischen Sack Hefe, während sie nach einem Fehler suchte, der sich niemals in ihren Händen befand, erforderte die Kenntnis der exakt falschen Dosis. Das war Fachwissen, nicht die Wut einer Nachbarin. Es passte zu der maschinengeschriebenen Beschwerde, die Paragraphen anführte, zu der Hand, die die Vorschrift zum Handwaschbecken in- und auswendig kannte. Derselbe Wissensstand, jetzt zum zweiten Mal, in zwei verschiedenen Waffen.</w:t>
+        <w:t xml:space="preserve">Man konnte ein Säuerungsmittel nicht einfach sackweise aus dem Regal eines Krämers kaufen. Es stammte von einem Bäckerzulieferer, über ein Kundenkonto, an Leute, von denen man wusste, dass sie vom Fach waren. Man konnte es auch nicht nach Augenmaß dosieren. Eine Prise zu wenig, und es wirkte nicht. Eine Schaufel zu viel, und das rohe Mehl roch scharf, sobald der Sack geöffnet wurde, und jeder Bäcker warf den Sack weg. Sie zu ruinieren und das Mehl so gesund aussehen und riechen zu lassen, dass sie es viermal backen würde, viermal in sauberen Chargen und mit einem frischen Sack Hefe, während sie nach einem Fehler suchte, der sich niemals in ihren Händen befand, erforderte die Kenntnis der exakt falschen Dosis. Das war Fachwissen, nicht blinde Wut aus der Nachbarschaft. Es passte zu der maschinengeschriebenen Beschwerde, die Paragraphen anführte, zu der Hand, die die Vorschrift zum Handwaschbecken in- und auswendig kannte. Derselbe Wissensstand, jetzt zum zweiten Mal, in zwei verschiedenen Waffen.</w:t>
       </w:r>
     </w:p>
     <w:p>
@@ -3085,7 +3085,7 @@
     </w:p>
     <w:p>
       <w:r>
-        <w:t>Ich stand da und sah dorthin, wohin er blickte, auf die dunklen Rückseiten der Läden, die zugeschneiten Stufen und die geschlossenen Türen. Die Magie konnte mir keinen Namen nennen. Das konnte sie nie. Sie hatte mehr Herz als Verstand, hatte mein Nick gesagt, und sie konnte nicht buchstabieren. Sie hatte zwei Tage lang mit dem Gesicht zu dieser Gasse gestanden, und nun neigte sie sich zu den Rückseiten der Läden, und ich konnte mir nicht erklären, warum.</w:t>
+        <w:t xml:space="preserve">Ich stand da und sah dorthin, wohin er blickte, auf die dunklen Rückseiten der Läden, die zugeschneiten Stufen und die geschlossenen Türen. Die Magie konnte mir keinen Namen nennen. Das konnte sie nie. Sie hatte mehr Herz als Verstand, hatte mein Nick gesagt, und sie konnte nicht buchstabieren. Er hatte zwei Tage lang mit dem Gesicht zu dieser Gasse gestanden, und nun neigte er sich zu den Rückseiten der Läden, und ich konnte mir nicht erklären, warum.</w:t>
       </w:r>
     </w:p>
     <w:p>
@@ -3218,7 +3218,7 @@
     <w:p/>
     <w:p>
       <w:r>
-        <w:t>Pete Garcia besaß die Rampe und zwanzig Winter lang das Entladen dort, wo keine Seele in Frost Falls zweimal hinsehen würde, wenn sein Lieferwagen dort stand. Er hatte einen Schlüssel für das gemeinsame Tor, mittlerweile zwei, funkelnagelneu von Toms Haken. Er trug den Groll gut hörbar zur Schau, genau wegen dieser Rampe. Und er war, seinen eigenen Aussagen nach, der einzige Mann gewesen, der im Dunkeln eine Gestalt an Gretas Hintertür gesehen hatte.</w:t>
+        <w:t xml:space="preserve">Pete Garcia hatte die Rampe und zwanzig Winter Erfahrung mit dem Entladen dort, wo keine Seele in Frost Falls zweimal hinsehen würde, wenn sein Lieferwagen dort stand. Er hatte einen Schlüssel für das gemeinsame Tor, mittlerweile zwei, funkelnagelneu von Toms Haken. Er trug den Groll gut hörbar zur Schau, genau wegen dieser Rampe. Und er war, seinen eigenen Aussagen nach, der einzige Mann gewesen, der im Dunkeln eine Gestalt an Gretas Hintertür gesehen hatte.</w:t>
       </w:r>
     </w:p>
     <w:p/>
@@ -3230,7 +3230,7 @@
     <w:p/>
     <w:p>
       <w:r>
-        <w:t>Es bereitete mir keine Freude. Ich hatte ihn gedanklich bereits für unschuldig befunden, ehe ich überhaupt wusste, dass das Mehl präpariert worden war. Gegen die schlichte Karte des Zugangs hielt diese vorab gefasste Milde nicht stand.</w:t>
+        <w:t xml:space="preserve">Es bereitete mir keine Freude. Ich hatte ihn gedanklich schon halb für unschuldig befunden, ehe ich überhaupt wusste, dass das Mehl präpariert worden war. Gegen die schlichte Karte des Zugangs hielt diese vorab gefasste Milde nicht stand.</w:t>
       </w:r>
     </w:p>
     <w:p/>
@@ -3394,7 +3394,7 @@
     <w:p/>
     <w:p>
       <w:r>
-        <w:t>»Ich will Sie nicht von Ihrer Arbeit abhalten«, sagte ich. »Ich bin gekommen, um Ihnen zu sagen, dass ich Sie im Verdacht hatte. Wegen Gretas Ärger. Aus der schlichten Tatsache heraus, dass Sie vor Sonnenaufgang auf diesem Hof sind und sonst niemand das Recht dazu hat.« Ich hatte die Erfahrung gemacht, dass es das Beste war, einem Mann die hässliche Sache ganz hinzureichen und ihn sie ansehen zu lassen. »Und ich bin gekommen, um Ihnen zu sagen, dass ich Sie wieder gestrichen habe. Wer auch immer das getan hat, brauchte ein finsteres Gemüt für die Dunkelheit und das Handwerk eines Bäckers für das Pulver, und Sie haben keins von beidem. Sie streiten sich am Mittag, und Sie schneiden Fleisch. Das passt nicht zu Ihnen.«</w:t>
+        <w:t xml:space="preserve">»Ich will Sie nicht von Ihrer Arbeit abhalten«, sagte ich. »Ich bin gekommen, um Ihnen zu sagen, dass ich Sie im Verdacht hatte. Wegen Gretas Ärger. Aus der schlichten Tatsache heraus, dass Sie vor Sonnenaufgang auf diesem Hof sind und sonst niemand das Recht dazu hat.« Ich hatte die Erfahrung gemacht, dass es das Beste war, einem Mann die hässliche Sache ganz hinzureichen und ihn sie ansehen zu lassen. »Und ich bin gekommen, um Ihnen zu sagen, dass ich Sie wieder gestrichen habe. Wer auch immer das getan hat, brauchte ein Gemüt für die Heimlichkeit im Dunkeln und das Handwerk eines Bäckers für das Pulver, und Sie haben keins von beidem. Sie streiten sich am Mittag, und Sie schneiden Fleisch. Das passt nicht zu Ihnen.«</w:t>
       </w:r>
     </w:p>
     <w:p/>
@@ -3424,7 +3424,7 @@
     <w:p/>
     <w:p>
       <w:r>
-        <w:t>»Diese Gestalt, von der ich Ihnen erzählt habe«, sagte er und wickelte das Kotelett ein, um das ich nicht gebeten hatte. »An ihrer Hintertür im Dunkeln. Das wollen Sie jetzt sicher ganz genau wissen, wo Sie mir glauben.« Er legte seine großen Hände flach auf den Hackblock und blickte durch sein Fenster auf die Ladenfronten der Evergreen Avenue auf der anderen Seite des Angers, als könne er durch sie hindurch bis auf den Hof blicken. »Ein Erwachsener. Kein Kind, egal, was die Stadt irgendwelchen Jungs mit Farbdosen anhängen will. Größer als Greta und zielstrebig. Kein Trödeln. Kein Händewärmen. Er wusste, warum er da war. Und verhüllt. Ein langer Mantel oder ein Kittel, weit, die Art, die man bei der Arbeit anzieht, damit man keine Flecken abkriegt – blass, möchte ich fast sagen, obwohl die Finsternis die Farbe verschluckt hat. Ganz dicht an ihrer Mauer, wo die Lieferungen ankommen und sonst kein ehrlicher Weg vorbeiführt. Und als meine Scheinwerfer um die Ecke kamen, war er weg, schnell und leise, kein Stolpern, sondern ein Aufbruch. Ohne Eile. Erledigt und weg.« Er schüttelte seinen grauen Kopf. »Kein Gesicht. Da war niemals ein Gesicht. Nur eine geschäftige Gestalt, die darauf achtete, nicht gesehen zu werden, und die Gretas Arbeitszeiten besser kannte, als ein Fremder sollte.« Er verschnürte das Papier. »Dieser Lieferwagen schon wieder, eines Morgens. Abgestellt an der Apotheke, der Motor tickte. Das Dach hoch, höher als ein Lieferwagen sein muss, mit einem Streifen roten Reflektorbandes an den Hecktüren. Beleuchtet wie zu Weihnachten, als meine Scheinwerfer ihn erfassten.«</w:t>
+        <w:t xml:space="preserve">»Diese Gestalt, von der ich Ihnen erzählt habe«, sagte er und wickelte das Kotelett ein, um das ich nicht gebeten hatte. »An ihrer Hintertür im Dunkeln. Das wollen Sie jetzt sicher ganz genau wissen, wo Sie mir glauben.« Er legte seine großen Hände flach auf den Hackblock und blickte durch sein Fenster auf die Ladenfronten der Evergreen Avenue auf der anderen Seite des Angers, als könne er durch sie hindurch bis auf den Hof blicken. »Jemand Erwachsenes. Kein Kind, egal, was die Stadt irgendwelchen Jungs mit Farbdosen anhängen will. Größer als Greta und zielstrebig. Kein Trödeln. Kein Händewärmen. Die Gestalt wusste, warum sie da war. Und verhüllt. Ein langer Mantel oder ein Kittel, weit, die Art, die man bei der Arbeit anzieht, damit man keine Flecken abkriegt – blass, möchte ich fast sagen, obwohl die Finsternis die Farbe verschluckt hat. Ganz dicht an ihrer Mauer, wo die Lieferungen ankommen und sonst kein ehrlicher Weg vorbeiführt. Und als meine Scheinwerfer um die Ecke kamen, war sie weg, schnell und leise, kein Stolpern, sondern ein Aufbruch. Ohne Eile. Erledigt und weg.« Er schüttelte seinen grauen Kopf. »Kein Gesicht. Da war niemals ein Gesicht. Nur eine geschäftige Gestalt, die darauf achtete, nicht gesehen zu werden, und die Gretas Arbeitszeiten besser kannte, als ein Fremder sollte.« Er verschnürte das Papier. »Dieser Lieferwagen schon wieder, eines Morgens. Abgestellt an der Apotheke, der Motor tickte. Das Dach hoch, höher als ein Lieferwagen sein muss, mit einem Streifen roten Reflektorbandes an den Hecktüren. Beleuchtet wie zu Weihnachten, als meine Scheinwerfer ihn erfassten.«</w:t>
       </w:r>
     </w:p>
     <w:p/>
@@ -3504,7 +3504,7 @@
     </w:p>
     <w:p>
       <w:r>
-        <w:t>»Du kennst die Familie vermutlich«, sagte Claire. »Seine Mutter macht die Schulessen. Und das Schlimmste daran, der Grund, warum es sich so rasch verbreitet, ist folgender: Er hat dieses vergangene Jahr bei Greta gearbeitet. Fegen, Kisten schleppen, abwaschen. Sie hat ihn vor einem Monat entlassen, noch bevor das alles hier anfing.« Sie zog das Kinn in ihren Kragen. »Da hat sich das Städtchen eben seinen Reim darauf gemacht. Ein Junge, den sie entlassen hat, der verstimmt darüber ist, nach Einbruch der Dunkelheit auf dem Anger herumtreibt und wenige Wochen später unschöne Worte an ihrer Wand hinterlässt.« Sie sah mich an. »Das schreibt sich quasi von selbst. Das ist es, was mir Angst macht. Niemand hat angehalten, um es wirklich zu lesen.«</w:t>
+        <w:t xml:space="preserve">»Du kennst die Familie vermutlich«, sagte Claire. »Seine Mutter macht die Schulessen. Und das Schlimmste daran, der Grund, warum es sich so rasch verbreitet, ist folgender: Er hat dieses vergangene Jahr bei Greta gearbeitet. Fegen, Kisten schleppen, abwaschen. Sie hat ihn vor einem Monat entlassen, noch bevor das alles hier anfing.« Sie zog das Kinn in ihren Kragen. »Da hat sich das Städtchen eben seinen Reim darauf gemacht. Ein Junge, den sie entlassen hat, der verstimmt darüber ist, sich nach Einbruch der Dunkelheit auf dem Anger herumtreibt und wenige Wochen später unschöne Worte an ihrer Wand hinterlässt.« Sie sah mich an. »Das schreibt sich quasi von selbst. Das ist es, was mir Angst macht. Niemand hat angehalten, um es wirklich zu lesen.«</w:t>
       </w:r>
     </w:p>
     <w:p>
@@ -3669,7 +3669,7 @@
     </w:p>
     <w:p>
       <w:r>
-        <w:t>»Er war es nicht gewesen«, sagte ich. »Er war die ganze Nacht zu Hause und hat auf seine Schwestern aufgepasst, und die Petersens haben in der einen Stunde, in der er Hustensaft holen ging, nach den Mädchen gesehen. Seine Mutter wird das bestätigen, und die Petersens ebenso.«</w:t>
+        <w:t xml:space="preserve">»Er war es nicht«, sagte ich. »Er war die ganze Nacht zu Hause und hat auf seine Schwestern aufgepasst, und die Petersens haben in der einen Stunde, in der er Hustensaft holen ging, nach den Mädchen gesehen. Seine Mutter wird das bestätigen, und die Petersens ebenso.«</w:t>
       </w:r>
     </w:p>
     <w:p>
@@ -3810,7 +3810,7 @@
     </w:p>
     <w:p>
       <w:r>
-        <w:t>Die Grange-Halle war für die zwei Sammlungen gemeinsam geöffnet worden – die von Hal und die des Vereins –, und die Leute aus Frost Falls waren aus der Kälte herbeigeströmt, um beide zu füllen. Hal stand in seinem guten Mantel am Ende bei den Lebensmittelfässern und war ganz scheu geworden angesichts des großen Andrangs. Er nahm Dosen entgegen und Wurzelgemüse und von einer Frau, die es sich eigentlich nicht leisten konnte, einen ganzen Schinken. Er schrieb keinen davon mit Namen auf. Nur als Stückzahl. Menschen, die seit dem Ärger mit Greta still und vorsichtig geworden waren, hatten sich nun geöffnet. Sie standen in einer warmen, lauten Halle und verschenkten ihre Wintervorräte an Nachbarn, deren Namen sie nie erfahren durften. Pip ging einmal die Reihe der Fässer entlang, fand die Sardinen in der zweiten und stellte sich demonstrativ darüber.</w:t>
+        <w:t xml:space="preserve">Die Grange-Halle war für die zwei Sammlungen gemeinsam geöffnet worden – die von Hal und die des Vereins –, und die Leute aus Frost Falls waren aus der Kälte herbeigeströmt, um beide zu füllen. Hal stand in seinem guten Mantel am Ende bei den Lebensmittelfässern und war ganz scheu geworden angesichts des großen Andrangs. Er nahm Dosen entgegen und Wurzelgemüse und von einer Frau, die es sich eigentlich nicht leisten konnte, einen ganzen Schinken. Er schrieb keinen davon mit Namen auf. Nur als Stückzahl. Menschen, die seit dem Ärger mit Greta still und vorsichtig geworden waren, hatten sich nun geöffnet. Sie standen in einer warmen, lauten Halle und verschenkten ihre Wintervorräte an Nachbarn, deren Namen sie nie erfahren durften. Pip ging einmal die Reihe der Fässer entlang, fand die Sardinen im zweiten und stellte sich demonstrativ darüber.</w:t>
       </w:r>
     </w:p>
     <w:p>
@@ -3860,7 +3860,7 @@
     </w:p>
     <w:p>
       <w:r>
-        <w:t>»Das ist Greta.« Joyce zog ihre Handschuhe aus der Tasche und streifte sie über. »Sagen Sie ihr nicht, dass das Brot von mir ist. Sie würde es zurückschicken, um ein Exempel zu statuieren, und die Häuser oben am Hang gingen leer aus.«</w:t>
+        <w:t xml:space="preserve">»Das ist Greta.« Joyce zog ihre Handschuhe aus der Tasche und streifte sie über. »Sagen Sie ihr nicht, dass das Brot von mir ist. Sie würde es aus Prinzip zurückschicken, und die Häuser oben am Hang gingen leer aus.«</w:t>
       </w:r>
     </w:p>
     <w:p>
@@ -3919,7 +3919,7 @@
     </w:p>
     <w:p>
       <w:r>
-        <w:t>Sie hing am schwarzen Brett der Grange zwischen den Räumplänen und den Kirchengemeinde-Essen, glänzend und blassgrau, tief festgepinnt hinter den Garderobenhaken, wo selbst Claire nicht nachgesehen hatte. Ich ging hin, um sie zu lesen wie alles andere, ohne etwas zu erwarten.</w:t>
+        <w:t xml:space="preserve">Er hing am schwarzen Brett der Grange zwischen den Räumplänen und den Kirchengemeinde-Essen, glänzend und blassgrau, tief festgepinnt hinter den Garderobenhaken, wo selbst Claire nicht nachgesehen hatte. Ich ging hin, um ihn zu lesen wie alles andere, ohne etwas zu erwarten.</w:t>
       </w:r>
     </w:p>
     <w:p>
@@ -3941,7 +3941,7 @@
     </w:p>
     <w:p>
       <w:r>
-        <w:t>Ich kannte die Woche. Jeder tat das. Die Türen hatten sich gestern geöffnet, und Ivy hatte in der Schlange gestanden. Was mich innehalten ließ, war unten in der Ecke, wo die Sekretärin der Grange das Blatt mit violetter Tinte gestempelt hatte, so wie sie alles stempelte, was sie auf ihr Brett ließ. Ich nahm es ab, um mir sicher zu sein. AUSGEHÄNGT, und ein Datum. 30. Oktober.</w:t>
+        <w:t xml:space="preserve">Ich kannte die Woche. Alle kannten sie. Die Türen hatten sich gestern geöffnet, und Ivy hatte in der Schlange gestanden. Was mich innehalten ließ, war unten in der Ecke, wo die Sekretärin der Grange das Blatt mit violetter Tinte gestempelt hatte, so wie sie alles stempelte, was sie auf ihr Brett ließ. Ich nahm es ab, um mir sicher zu sein. AUSGEHÄNGT, und ein Datum. 30. Oktober.</w:t>
       </w:r>
     </w:p>
     <w:p>
@@ -3975,7 +3975,7 @@
     </w:p>
     <w:p>
       <w:r>
-        <w:t>Man konnte eine große Eröffnung nicht auf eine Schließung datieren, die noch gar nicht stattgefunden hatte. Nicht aus Glück. Nicht, es sei denn, man wusste, dass sie bevorstand, weil man selbst diejenige war, die sie herbeiführte.</w:t>
+        <w:t xml:space="preserve">Man konnte eine große Eröffnung nicht auf eine Schließung datieren, die noch gar nicht stattgefunden hatte. Nicht aus Glück. Nicht, es sei denn, man wusste, dass sie bevorstand, weil man sie selbst herbeiführte.</w:t>
       </w:r>
     </w:p>
     <w:p>
@@ -4036,7 +4036,7 @@
         <w:rPr>
           <w:i/>
         </w:rPr>
-        <w:t>Getrocknete Säure. Jemand hat das dorthin getan. Und diejenige Person wusste genau, wie viel sie hineintun musste.</w:t>
+        <w:t xml:space="preserve">Getrocknete Säure. Jemand hat das dorthin getan. Und wer immer es war, wusste genau, wie viel hineingehörte.</w:t>
       </w:r>
       <w:r>
         <w:t xml:space="preserve"> Eine Säure, hatte sie gesagt, so locker wie das Wetter, zu einem Kreis von Frauen an einem Lebensmittelfass. Ein Pulver, das von einem Lieferanten auf ihre Bestellung hin in ihr Mehl gemischt worden war, der ihr hineintat, was immer sie auf den Bestellzettel schrieb. Eine Frau, die aufs Haar genau wusste, was ein Teig vertrug, und die folglich wusste, wie viel ihn ruinieren würde.</w:t>
@@ -4119,7 +4119,7 @@
     </w:p>
     <w:p>
       <w:r>
-        <w:t>Ich hatte mich im Dunkeln, während Nick schlief, für den Kranz entschieden, den einen Vorwand, der mich ohne einen schiefen Ton durch ihre goldene Tür lassen würde, weil er nicht schief war. Die Frauen des Strickkreises schmückten die gesamte Avenue für die Saison, jede Ladentür daran, und ein neuer Laden war eine neue Tür. Renée in der Eröffnungswoche keinen Kranz für das Sugarplum anzubieten, wäre das Auffälligste überhaupt gewesen. Während also meine Hände mit dem Balsamtannengrün beschäftigt waren, würde ich das andere tun, weswegen ich gekommen war. Sie genau lesen. Nahe genug heran, um herauszufinden, worüber der Zauber gelegt worden war. Dasselbe hatte ich bei Pete über seinem Hackklotz getan.</w:t>
+        <w:t xml:space="preserve">Ich hatte mich im Dunkeln, während Nick schlief, für den Kranz entschieden, den einen Vorwand, der mich ohne einen schiefen Ton durch ihre goldene Tür lassen würde, weil er nicht schief war. Die Frauen des Strickkreises schmückten die gesamte Avenue für die Saison, jede Ladentür daran, und ein neuer Laden war eine neue Tür. Renée in der Eröffnungswoche keinen Kranz für das Sugarplum anzubieten, wäre das Auffälligste überhaupt gewesen. Während also meine Hände mit dem Balsamtannengrün beschäftigt waren, würde ich das andere tun, weswegen ich gekommen war. Sie genau lesen. Nahe genug heran, um herauszufinden, worüber der Charme gelegt worden war. Dasselbe hatte ich bei Pete über seinem Hackklotz getan.</w:t>
       </w:r>
     </w:p>
     <w:p>
@@ -4134,7 +4134,7 @@
     </w:p>
     <w:p>
       <w:r>
-        <w:t>»Mrs. Claus.« Renée kam mit ausgebreiteten Händen und strahlendem Gesicht aus dem Hinterzimmer, als wäre ich der einzige Mensch gewesen, den sie den ganzen Morgen hatte sehen wollen. »Und an meinem dritten Tag. Verzeihen Sie das Chaos, wir sind kaum eingerichtet.« Das Chaos bestand aus gefüllten Vitrinen, Reihen kleiner glasierter Dinge in so geraden Linien, als wären sie gedruckt worden. Kein Krümel auf dem Marmor. »Sie sind gekommen, um ihn geschmückt zu sehen. Ist es nicht schöner mit der Kundschaft im Schaufenster?«</w:t>
+        <w:t xml:space="preserve">»Mrs. Claus.« Renée kam mit ausgebreiteten Händen und strahlendem Gesicht aus dem Hinterzimmer, als wäre ich der einzige Mensch gewesen, den sie den ganzen Morgen hatte sehen wollen. »Und an meinem dritten Tag. Verzeihen Sie das Chaos, wir sind kaum eingerichtet.« Das Chaos bestand aus gefüllten Vitrinen, Reihen kleiner glasierter Dinge in so geraden Linien, als wären sie gedruckt worden. Kein Krümel auf dem Marmor. »Sie sind gekommen, um ihn geschmückt zu sehen. Ist es nicht schöner mit der Ware im Schaufenster?«</w:t>
       </w:r>
     </w:p>
     <w:p>
@@ -4169,7 +4169,7 @@
     </w:p>
     <w:p>
       <w:r>
-        <w:t>»Greta führt das Geschäft schon eine ganze Weile«, sagte ich mild.</w:t>
+        <w:t xml:space="preserve">»Greta bewältigt die Saison schon eine ganze Weile«, sagte ich mild.</w:t>
       </w:r>
     </w:p>
     <w:p>
@@ -4189,7 +4189,7 @@
     </w:p>
     <w:p>
       <w:r>
-        <w:t>Und woher wollte sie das wissen? Das vorläufige Verbot betraf Greta, Varney und mich. Die Leute wussten, dass das Geschäft geschlossen war. Vom Fugenmörtel wussten sie nichts, weil Greta zu stolz war, das herumzuerzählen, und ich hatte es auch nicht getan. Nur der Inspektor wusste vom Fugenmörtel und derjenige, der geschrieben hatte, um ihm zu sagen, wo er danach suchen musste.</w:t>
+        <w:t xml:space="preserve">Und woher wollte sie das wissen? Das vorläufige Verbot betraf Greta, Varney und mich. Die Leute wussten, dass das Geschäft geschlossen war. Vom Fugenmörtel wussten sie nichts, weil Greta zu stolz war, das herumzuerzählen, und ich hatte es auch nicht getan. Nur der Inspektor wusste vom Fugenmörtel und wer auch immer ihm geschrieben hatte, wo er danach suchen musste.</w:t>
       </w:r>
     </w:p>
     <w:p>
@@ -4254,7 +4254,7 @@
     </w:p>
     <w:p>
       <w:r>
-        <w:t>Ich war hineingegangen, um sie zu lesen. Ich hatte sie gelesen. Um die Hälfte zu froh über Gretas Sturz und allzu genau vertraut mit den Einzelheiten desselben. Unter dem Charme das Aufflackern einer Frau, die eine Saison, die noch gar nicht gekommen war, bereits ausgegeben hatte. Jetzt kannte ich sie. Ich hätte darauf geschworen. Aber ich würde etwas brauchen, auf dem ihr Name stand, etwas, das ein Kranz und ein Kaffee nicht abwaschen konnten.</w:t>
+        <w:t xml:space="preserve">Ich war hineingegangen, um sie zu lesen. Ich hatte sie gelesen. Viel zu froh über Gretas Sturz und allzu genau vertraut mit den Einzelheiten desselben. Unter dem Charme das Aufflackern einer Frau, die eine Saison, die noch gar nicht gekommen war, bereits ausgegeben hatte. Jetzt kannte ich sie. Ich hätte darauf geschworen. Aber ich würde etwas brauchen, auf dem ihr Name stand, etwas, das ein Kranz und ein Kaffee nicht abwaschen konnten.</w:t>
       </w:r>
     </w:p>
     <w:p>
@@ -4282,7 +4282,7 @@
     <w:p/>
     <w:p>
       <w:r>
-        <w:t>»Sie haben aufgehört«, sagte er, bevor ich fragen konnte. »Die Blicke. Was immer Sie Ms. Bennett gesagt haben, es hat sich herumgesprochen. Irgendeine Dame in der Schule hat meiner Mutter klipp und klar gesagt, ich sei das unmöglich gewesen.« Er schaute auf die Honigbonbons statt auf mich. »Also. Danke. Ich weiß, dass Sie das waren.«</w:t>
+        <w:t xml:space="preserve">»Sie haben aufgehört«, sagte er, bevor ich fragen konnte. »Die Blicke. Was immer Sie Ms. Bennett gesagt haben, es hat sich herumgesprochen. Irgendeine Dame in der Schule hat meiner Mutter klipp und klar gesagt, ich könne es unmöglich gewesen sein.« Er schaute auf die Honigbonbons statt auf mich. »Also. Danke. Ich weiß, dass Sie das waren.«</w:t>
       </w:r>
     </w:p>
     <w:p/>
@@ -4336,7 +4336,7 @@
     <w:p/>
     <w:p>
       <w:r>
-        <w:t>»Es gab da einen Morgen, da habe ich jemanden hinten bei Greta gesehen. Stockdunkel, bevor ihre Öfen brannten, noch kein Licht in ihrem Fenster. Ein Erwachsener in einer Bäckerschürze. Nicht Greta. Greta ist kräftig, und diese Person war schmal. Schnell und ordentlich, nicht wie jemand, der gerade seine Schicht beginnt. Eine lange Schürze, die bis zu den Schienbeinen reicht, blass, mit einem Mantel darunter. Sie stand eine Minute an ihrer Hintertür und ging dann die Gasse hoch Richtung Ende. Sie ist nirgendwo hineingegangen. Hinter dem Licht an der Apotheke habe ich sie aus den Augen verloren.« Er runzelte die Stirn. »Ich dachte mir, es wäre eine Lieferung.«</w:t>
+        <w:t xml:space="preserve">»Es gab da einen Morgen, da habe ich jemanden hinten bei Greta gesehen. Stockdunkel, bevor ihre Öfen brannten, noch kein Licht in ihrem Fenster. Jemand Erwachsenes in einer Bäckerschürze. Nicht Greta. Greta ist kräftig, und diese Person war schmal. Schnell und ordentlich, nicht wie jemand, der gerade seine Schicht beginnt. Eine lange Schürze, die bis zu den Schienbeinen reicht, blass, mit einem Mantel darunter. Sie stand eine Minute an ihrer Hintertür und ging dann die Gasse hoch Richtung Ende. Sie ist nirgendwo hineingegangen. Hinter dem Licht an der Apotheke habe ich sie aus den Augen verloren.« Er runzelte die Stirn. »Ich dachte mir, es wäre eine Lieferung.«</w:t>
       </w:r>
     </w:p>
     <w:p/>
@@ -4384,7 +4384,7 @@
     <w:p/>
     <w:p>
       <w:r>
-        <w:t>Ich begleitete ihn bis zur Maple, und er ging auf ihr entlang, mit seiner Papiertüte voller Hustensaft und erhobenem Haupt.</w:t>
+        <w:t xml:space="preserve">Ich begleitete ihn bis zur Maple, und er ging sie entlang, mit seiner Papiertüte voller Hustensaft und erhobenem Haupt.</w:t>
       </w:r>
     </w:p>
     <w:p/>
@@ -4630,7 +4630,7 @@
     <w:p/>
     <w:p>
       <w:r>
-        <w:t>Draußen auf der Stufe bückte sich Doc und band seinen Schnürsenkel zu. Pip beobachtete ihn dabei mit größtem Interesse und tat keinen Mucks, ihn daran zu hindern.</w:t>
+        <w:t xml:space="preserve">Draußen auf der Stufe bückte sich Doc und band seinen Schnürsenkel zu. Pip beobachtete ihn dabei mit größtem Interesse und machte keine Anstalten, ihn daran zu hindern.</w:t>
       </w:r>
     </w:p>
     <w:p/>
@@ -4713,7 +4713,7 @@
     <w:p/>
     <w:p>
       <w:r>
-        <w:t>Der Frost kam ganz ohne Vorwarnung im Wetter, so wie die strengen Fröste, hatte Dot mir gesagt, immer kamen. Nur ein wolkenloser, starrer Himmel und eine Temperatur, die die ganze Nacht über sank wie ein geworfener Stein. Ich erwachte in Räumen, deren Fensterscheiben bis in die Ecken mit eisigen Farnmustern bedeckt waren, während die Rohre in meinen Wänden vor Kälte knackten, und ich dachte, ehe ich an irgendetwas anderes dachte, an das schmale Backsteingebäude des Historischen Vereins am Platz und den alten Kessel, der in seinem Keller pochte. Ein Kessel, der bei Tauwetter kaum hinterherkam, hielt einer so kalten Nacht nicht immer stand.</w:t>
+        <w:t xml:space="preserve">Der Frost kam ganz ohne Vorwarnung im Wetter, so wie die strengen Fröste, hatte Dot mir gesagt, immer kamen. Nur ein wolkenloser, starrer Himmel und eine Temperatur, die die ganze Nacht über sank wie ein Stein, den man fallen lässt. Ich erwachte in Räumen, deren Fensterscheiben bis in die Ecken mit eisigen Farnmustern bedeckt waren, während die Rohre in meinen Wänden vor Kälte knackten, und ich dachte, ehe ich an irgendetwas anderes dachte, an das schmale Backsteingebäude des Historischen Vereins am Platz und den alten Kessel, der in seinem Keller pochte. Ein Kessel, der bei Tauwetter kaum hinterherkam, hielt einer so kalten Nacht nicht immer stand.</w:t>
       </w:r>
     </w:p>
     <w:p>
@@ -4753,7 +4753,7 @@
     </w:p>
     <w:p>
       <w:r>
-        <w:t>Der versiegelte Karton stand an seinem Platz im vorderen Raum, das Leck war nirgendwo in seiner Nähe. Er stand gut zwei Meter entfernt und war glücklicherweise sicher. Doch eine weitere Fuge und eine weitere kalte Nacht würden diesen Abstand schrumpfen lassen.</w:t>
+        <w:t xml:space="preserve">Die versiegelte Kiste stand an ihrem Platz im vorderen Raum, das Leck war nirgendwo in ihrer Nähe. Sie stand gut zwei Meter entfernt und war glücklicherweise sicher. Doch eine weitere Fuge und eine weitere kalte Nacht würden diesen Abstand schrumpfen lassen.</w:t>
       </w:r>
     </w:p>
     <w:p>
@@ -4813,7 +4813,7 @@
     </w:p>
     <w:p>
       <w:r>
-        <w:t>Er hatte niemandem etwas gesagt. Er hatte vorgehabt, das einzige wertvolle Ding, das er besaß, zu verkaufen und das Geld heimlich für den Ort zu verwenden, von dem er zurückgetreten war. Es sollte in den Büchern als anonyme Spende auftauchen, ohne dass er dafür Dank einheimste oder von irgendjemandem bedankt wurde. Dankbarkeit war genau das, wogegen er sich gewehrt hatte und wogegen er sich wehren wollte, koste es ihn, was es wolle.</w:t>
+        <w:t xml:space="preserve">Er hatte niemandem etwas gesagt. Er hatte vorgehabt, das einzige wertvolle Ding, das er besaß, zu verkaufen und das Geld heimlich für den Ort zu verwenden, von dem er zurückgetreten war. Es sollte in den Büchern als anonyme Spende auftauchen, ohne dass er dafür Anerkennung einheimste oder dass ihm irgendjemand dankte. Dankbarkeit war genau das, wogegen er sich gewehrt hatte und wogegen er sich wehren wollte, koste es ihn, was es wolle.</w:t>
       </w:r>
     </w:p>
     <w:p>
@@ -4950,7 +4950,94 @@
     </w:p>
     <w:p>
       <w:r>
-        <w:t xml:space="preserve">»Er kam aus ihrer Mauer. Das ist alles, worauf ich schwören kann.« Ich legte einen Finger auf den Löffel, dorthin, wo die Gasse hinter den Läden verlief. »Dieser Müllcontainer steht offen in einer öffentlichen Gasse. Kein Deckel, kein Schloss. Pete läuft daran vorbei. Die Lieferanten setzen rückwärts daran heran. Ein Kind könnte einen Ziegelstein daraus heben. Ich sah ihren Bauschutt auf diesem Ziegelstein und las ihren Namen. Dreh es um. Wenn du gewollt hättest, dass die Stadt auf das </w:t>
+        <w:t xml:space="preserve">»Er kam aus ihrer Mauer. Das ist alles, worauf ich schwören kann.« Ich legte einen Finger auf den Löffel, dorthin, wo die Gasse hinter den Läden verlief. »Dieser Müllcontainer steht offen in einer öffentlichen Gasse. Kein Deckel, kein Schloss. Pete läuft daran vorbei. Die Lieferanten setzen rückwärts daran heran. Ein Kind könnte einen Ziegelstein daraus heben. Ich sah ihren Bauschutt auf diesem Ziegelstein und las ihren Namen. Dreh es um. Wenn du wolltest, dass die Stadt auf das Sugarplum schaut, wo würdest du</w:t>
+      </w:r>
+      <w:r>
+        <w:t xml:space="preserve"/>
+      </w:r>
+      <w:r>
+        <w:t xml:space="preserve"/>
+      </w:r>
+      <w:r>
+        <w:t xml:space="preserve"/>
+      </w:r>
+      <w:r>
+        <w:t xml:space="preserve"> dir einen Ziegelstein besorgen?«</w:t>
+      </w:r>
+    </w:p>
+    <w:p>
+      <w:r>
+        <w:t xml:space="preserve">Er antwortete darauf nicht, sondern drängte stattdessen weiter. »Oder sie war wütend und hat sich das Nächstbeste geschnappt. Das machen Leute nun mal.«</w:t>
+      </w:r>
+    </w:p>
+    <w:p>
+      <w:r>
+        <w:t>»Wer immer diesen Ziegelstein geworfen hat, war nicht in Rage. Er flog durch die goldenen Buchstaben von Gretas Namen in einer Nacht, in der niemand auf der Straße war. Und Renée setzte mich hin und zählte mir die Kirchengemeindeessen dieser Stadt auf. Sie schnappt sich nicht das Nächstbeste.«</w:t>
+      </w:r>
+    </w:p>
+    <w:p>
+      <w:r>
+        <w:t>»Oder sie dachte, niemand würde den Mörtel zweimal ansehen.«</w:t>
+      </w:r>
+    </w:p>
+    <w:p>
+      <w:r>
+        <w:t>»Ich habe ihn mir zweimal angesehen«, sagte ich, »und ihren Namen gesehen, weil ich danach gesucht hatte.«</w:t>
+      </w:r>
+    </w:p>
+    <w:p>
+      <w:r>
+        <w:t>Er ließ das so stehen, und für einen Moment war das einzige Geräusch in der Küche Pip, die sich an dem Knopf abarbeitete.</w:t>
+      </w:r>
+    </w:p>
+    <w:p>
+      <w:r>
+        <w:t>* * *</w:t>
+      </w:r>
+    </w:p>
+    <w:p>
+      <w:r>
+        <w:t>»Die Schachtel«, sagte er. »Dannys goldener Karton.«</w:t>
+      </w:r>
+    </w:p>
+    <w:p>
+      <w:r>
+        <w:t>»Derselbe Müllcontainer. Seit sie den Laden eingerichtet hat, liegt er voll mit ihren flachgedrückten Kartons. Goldene Schrift auf jedem einzelnen. Ich bin daran vorbeigegangen.« Ich klopfte auf den Zuckerdeckel, wo er hinter dem Pfeffer lag. »Ich sah eine goldene Schachtel vor Gretas Tür und hielt sie für Renée, die dort stand. Alles, was mir das sagt, ist, dass die Schachtel einmal ihr gehörte. Jede Schachtel in diesem Müllcontainer gehörte einmal ihr.«</w:t>
+      </w:r>
+    </w:p>
+    <w:p>
+      <w:r>
+        <w:t>»Sie hätte sie selbst dorthin tragen können.«</w:t>
+      </w:r>
+    </w:p>
+    <w:p>
+      <w:r>
+        <w:t>»Das hätte sie. Eine Frau, die keinen Pinguin über ihre Schwelle lässt, schleppt ihr Pulver in einer Schachtel zur Arbeit, auf deren Seite der Name ihres Ladens prangt.« Ich schüttelte den Kopf bei dem Bild davon. »Das würde ich einer unvorsichtigen Frau zutrauen. Das ist sie nicht.«</w:t>
+      </w:r>
+    </w:p>
+    <w:p>
+      <w:r>
+        <w:t>Pip gab den Knopf auf und kam unter den Tisch, um sich an meinen nassen Strumpf zu lehnen, was sie offenbar als eine Verbesserung gegenüber den Backsteinen empfand.</w:t>
+      </w:r>
+    </w:p>
+    <w:p>
+      <w:r>
+        <w:t>* * *</w:t>
+      </w:r>
+    </w:p>
+    <w:p>
+      <w:r>
+        <w:t>»Petes Lieferwagen«, sagte ich. »Er hat es mir zweimal erzählt. Einmal an seinem Hackblock, über deinem Braten. Ein Lieferwagen oben bei der Apotheke vor dem Morgengrauen. Licht aus. Nicht der Fleischwagen. Ein auswärtiges Kennzeichen, das er nicht erfasst hat. Dann noch einmal, an dem Morgen, als ich ging, um ihn zu entlasten. Dieselbe Stelle. Motor tickt.«</w:t>
+      </w:r>
+    </w:p>
+    <w:p>
+      <w:r>
+        <w:t>»Ich erinnere mich, dass du es mir erzählt hast. Du hast dir nicht viel dabei gedacht.«</w:t>
+      </w:r>
+    </w:p>
+    <w:p>
+      <w:r>
+        <w:t xml:space="preserve">»Ich habe mir gar nichts dabei gedacht. Ein Fahrer, der für ein Nickerchen hielt. Aber Pete kennt jeden Lastwagen, der auf diesen Hof kommt, und er sagte, es sei nicht der vom Fleischlieferanten gewesen, und ich habe daraus ›von niemandem‹ gemacht.« Ich bewegte meinen Finger den Löffel hinauf zum Pfeffer. »Und Dannys Gestalt. Schlank und schnell, an Gretas Schwelle, bevor ihre Öfen angingen, und nach oben hin zum fernen Ende verschwunden. Ich habe ›das Goldgeschäft‹ herausgehört. Er hat nie gesagt, dass es ins </w:t>
       </w:r>
       <w:r>
         <w:t/>
@@ -4962,32 +5049,57 @@
         <w:t/>
       </w:r>
       <w:r>
-        <w:t xml:space="preserve"> schaut, wo würdest du dir einen Ziegelstein besorgen?«</w:t>
-      </w:r>
-    </w:p>
-    <w:p>
-      <w:r>
-        <w:t>Er antwortete darauf nicht, sondern drängte stattdessen weiter. »Oder sie war wütend und hat sich das Nächstbeste geschnappt. Das tun Leute so.«</w:t>
-      </w:r>
-    </w:p>
-    <w:p>
-      <w:r>
-        <w:t>»Wer immer diesen Ziegelstein geworfen hat, war nicht in Rage. Er flog durch die goldenen Buchstaben von Gretas Namen in einer Nacht, in der niemand auf der Straße war. Und Renée setzte mich hin und zählte mir die Kirchengemeindeessen dieser Stadt auf. Sie schnappt sich nicht das Nächstbeste.«</w:t>
-      </w:r>
-    </w:p>
-    <w:p>
-      <w:r>
-        <w:t>»Oder sie dachte, niemand würde den Mörtel zweimal ansehen.«</w:t>
-      </w:r>
-    </w:p>
-    <w:p>
-      <w:r>
-        <w:t>»Ich habe ihn mir zweimal angesehen«, sagte ich, »und ihren Namen gesehen, weil ich danach gesucht hatte.«</w:t>
-      </w:r>
-    </w:p>
-    <w:p>
-      <w:r>
-        <w:t>Er ließ das so stehen, und für einen Moment war das einzige Geräusch in der Küche Pip, die sich an dem Knopf abarbeitete.</w:t>
+        <w:t xml:space="preserve"> ging. Er sagte zum fernen Ende. Ich habe den Laden dort selbst platziert.«</w:t>
+      </w:r>
+    </w:p>
+    <w:p>
+      <w:r>
+        <w:t>»Renée ist aus Montreal heruntergekommen«, sagte Nick. »Das ist ein auswärtiges Kennzeichen, wenn sie es nicht gewechselt hat.«</w:t>
+      </w:r>
+    </w:p>
+    <w:p>
+      <w:r>
+        <w:t>»Das könnte sein. Aber was will sie überhaupt mit einem Lieferwagen? Ihre Hintertür liegt an dieser Gasse. Sie könnte aus ihrer Tür herausgehen, runter zu Gretas Schwelle und wieder nach Hause, und sich nie auf der Avenue blicken lassen.« Ich ließ meinen Finger auf dem Pfeffer liegen. »Ein Lieferwagen mit ausgeschaltetem Licht ist für jemanden, der von irgendwoher kommen und vor Tagesanbruch wieder dorthin zurückkehren muss.«</w:t>
+      </w:r>
+    </w:p>
+    <w:p>
+      <w:r>
+        <w:t>Nick betrachtete den Löffel eine Weile.</w:t>
+      </w:r>
+    </w:p>
+    <w:p>
+      <w:r>
+        <w:t>»Und dein Schneemann«, sagte er. »Den Schneemann wirst du wohl auch noch durchgehen wollen.«</w:t>
+      </w:r>
+    </w:p>
+    <w:p>
+      <w:r>
+        <w:t>Ich nahm eine Kruste vom Schneidebrett und legte sie knapp hinter den Pfeffer, an das allerletzte Ende des Löffels, wo die Gasse auf offenes Gelände mündete.</w:t>
+      </w:r>
+    </w:p>
+    <w:p>
+      <w:r>
+        <w:t/>
+      </w:r>
+    </w:p>
+    <w:p>
+      <w:r>
+        <w:t>»An dem Morgen, als sie alle liefen, gingen die anderen zum Anger und neigten sich die Lane hinauf zu deinem Kamin. Dieser eine ging in die entgegengesetzte Richtung, drei Meter abseits ihrer Gesellschaft, vorbei an der Apotheke, bis zum Ende der Gasse. Ich stellte mich vor ihn hin und fragte ihn, worauf er blickte.« Ich berührte die Kruste, wo sie abseits für sich lag. »Ich hatte mir in den Kopf gesetzt, dass er auf etwas blickte. Ich habe nie gefragt, wo er stand. Auf dem einzigen Fleck an diesem Ende, wo ein Lieferwagen von der Avenue abbiegen konnte, ohne dass es an Gretas Ende jemand sah.«</w:t>
+      </w:r>
+    </w:p>
+    <w:p>
+      <w:r>
+        <w:t>»Er kann kein Kennzeichen lesen, Jess.« Er sagte es sanft. »Er kann dir gar nichts sagen.«</w:t>
+      </w:r>
+    </w:p>
+    <w:p>
+      <w:r>
+        <w:t>»Nein. Er stand zwei Tage lang auf einem Parkplatz, und ich bin diejenige, die sagen muss, warum.«</w:t>
+      </w:r>
+    </w:p>
+    <w:p>
+      <w:r>
+        <w:t>Pip war unter dem Tisch hervorgekommen. Sie stellte sich am Rand des Tisches auf die Zehenspitzen, musterte die Kruste am Ende des Löffels und entschied sich dagegen.</w:t>
       </w:r>
     </w:p>
     <w:p>
@@ -4997,118 +5109,6 @@
     </w:p>
     <w:p>
       <w:r>
-        <w:t>»Die Schachtel«, sagte er. »Dannys goldener Karton.«</w:t>
-      </w:r>
-    </w:p>
-    <w:p>
-      <w:r>
-        <w:t>»Derselbe Müllcontainer. Seit sie den Laden eingerichtet hat, liegt er voll mit ihren flachgedrückten Kartons. Goldene Schrift auf jedem einzelnen. Ich bin daran vorbeigegangen.« Ich klopfte auf den Zuckerdeckel, wo er hinter dem Pfeffer lag. »Ich sah eine goldene Schachtel vor Gretas Tür und hielt sie für Renée, die dort stand. Alles, was mir das sagt, ist, dass die Schachtel einmal ihr gehörte. Jede Schachtel in diesem Müllcontainer gehörte einmal ihr.«</w:t>
-      </w:r>
-    </w:p>
-    <w:p>
-      <w:r>
-        <w:t>»Sie hätte sie selbst dorthin tragen können.«</w:t>
-      </w:r>
-    </w:p>
-    <w:p>
-      <w:r>
-        <w:t>»Das hätte sie. Eine Frau, die keinen Pinguin über ihre Schwelle lässt, schleppt ihr Pulver in einer Schachtel zur Arbeit, auf deren Seite der Name ihres Ladens prangt.« Ich schüttelte den Kopf bei dem Bild davon. »Das würde ich einer unvorsichtigen Frau zutrauen. Das ist sie nicht.«</w:t>
-      </w:r>
-    </w:p>
-    <w:p>
-      <w:r>
-        <w:t>Pip gab den Knopf auf und kam unter den Tisch, um sich an meinen nassen Strumpf zu lehnen, was sie offenbar als eine Verbesserung gegenüber den Backsteinen empfand.</w:t>
-      </w:r>
-    </w:p>
-    <w:p>
-      <w:r>
-        <w:t>* * *</w:t>
-      </w:r>
-    </w:p>
-    <w:p>
-      <w:r>
-        <w:t>»Petes Lieferwagen«, sagte ich. »Er hat es mir zweimal erzählt. Einmal an seinem Hackblock, über deinem Braten. Ein Lieferwagen oben bei der Apotheke vor dem Morgengrauen. Licht aus. Nicht der Fleischwagen. Ein auswärtiges Kennzeichen, das er nicht erfasst hat. Dann noch einmal, an dem Morgen, als ich ging, um ihn zu entlasten. Dieselbe Stelle. Motor tickt.«</w:t>
-      </w:r>
-    </w:p>
-    <w:p>
-      <w:r>
-        <w:t>»Ich erinnere mich, dass du es mir erzählt hast. Du hast dir nicht viel dabei gedacht.«</w:t>
-      </w:r>
-    </w:p>
-    <w:p>
-      <w:r>
-        <w:t xml:space="preserve">»Ich habe mir gar nichts dabei gedacht. Ein Fahrer, der für ein Nickerchen hielt. Aber Pete kennt jeden Lastwagen, der auf diesen Hof kommt, und er sagte, es sei nicht der vom Fleischlieferanten gewesen, und ich habe daraus ›von niemandem‹ gemacht.« Ich bewegte meinen Finger den Löffel hinauf zum Pfeffer. »Und Dannys Gestalt. Schlank und schnell, an Gretas Schwelle, bevor ihre Öfen angingen, und nach oben hin zum fernen Ende verschwunden. Ich habe ›das Goldgeschäft‹ herausgehört. Er hat nie gesagt, dass es ins </w:t>
-      </w:r>
-      <w:r>
-        <w:t/>
-      </w:r>
-      <w:r>
-        <w:t>Sugarplum</w:t>
-      </w:r>
-      <w:r>
-        <w:t/>
-      </w:r>
-      <w:r>
-        <w:t xml:space="preserve"> ging. Er sagte zum fernen Ende. Ich habe den Laden dort selbst platziert.«</w:t>
-      </w:r>
-    </w:p>
-    <w:p>
-      <w:r>
-        <w:t>»Renée ist aus Montreal heruntergekommen«, sagte Nick. »Das ist ein auswärtiges Kennzeichen, wenn sie es nicht gewechselt hat.«</w:t>
-      </w:r>
-    </w:p>
-    <w:p>
-      <w:r>
-        <w:t>»Das könnte sein. Aber was will sie überhaupt mit einem Lieferwagen? Ihre Hintertür liegt an dieser Gasse. Sie könnte aus ihrer Tür herausgehen, runter zu Gretas Schwelle und wieder nach Hause, und sich nie auf der Avenue blicken lassen.« Ich ließ meinen Finger auf dem Pfeffer liegen. »Ein Lieferwagen mit ausgeschaltetem Licht ist für jemanden, der von irgendwoher kommen und vor Tagesanbruch wieder dorthin zurückkehren muss.«</w:t>
-      </w:r>
-    </w:p>
-    <w:p>
-      <w:r>
-        <w:t>Nick betrachtete den Löffel eine Weile.</w:t>
-      </w:r>
-    </w:p>
-    <w:p>
-      <w:r>
-        <w:t>»Und dein Schneemann«, sagte er. »Den Schneemann wirst du wohl auch noch durchgehen wollen.«</w:t>
-      </w:r>
-    </w:p>
-    <w:p>
-      <w:r>
-        <w:t>Ich nahm eine Kruste vom Schneidebrett und legte sie knapp hinter den Pfeffer, an das allerletzte Ende des Löffels, wo die Gasse auf offenes Gelände mündete.</w:t>
-      </w:r>
-    </w:p>
-    <w:p>
-      <w:r>
-        <w:t/>
-      </w:r>
-    </w:p>
-    <w:p>
-      <w:r>
-        <w:t>»An dem Morgen, als sie alle liefen, gingen die anderen zum Anger und neigten sich die Lane hinauf zu deinem Kamin. Dieser eine ging in die entgegengesetzte Richtung, drei Meter abseits ihrer Gesellschaft, vorbei an der Apotheke, bis zum Ende der Gasse. Ich stellte mich vor ihn hin und fragte ihn, worauf er blickte.« Ich berührte die Kruste, wo sie abseits für sich lag. »Ich hatte mir in den Kopf gesetzt, dass er auf etwas blickte. Ich habe nie gefragt, wo er stand. Auf dem einzigen Fleck an diesem Ende, wo ein Lieferwagen von der Avenue abbiegen konnte, ohne dass es an Gretas Ende jemand sah.«</w:t>
-      </w:r>
-    </w:p>
-    <w:p>
-      <w:r>
-        <w:t>»Er kann kein Kennzeichen lesen, Jess.« Er sagte es sanft. »Er kann dir gar nichts sagen.«</w:t>
-      </w:r>
-    </w:p>
-    <w:p>
-      <w:r>
-        <w:t>»Nein. Er stand zwei Tage lang auf einem Parkplatz, und ich bin diejenige, die sagen muss, warum.«</w:t>
-      </w:r>
-    </w:p>
-    <w:p>
-      <w:r>
-        <w:t>Pip war unter dem Tisch hervorgekommen. Sie stellte sich am Rand des Tisches auf die Zehenspitzen, musterte die Kruste am Ende des Löffels und entschied sich dagegen.</w:t>
-      </w:r>
-    </w:p>
-    <w:p>
-      <w:r>
-        <w:t>* * *</w:t>
-      </w:r>
-    </w:p>
-    <w:p>
-      <w:r>
         <w:t>»Bleibt noch der Flyer«, sagte Nick. »Das ist der, bei dem du dir am sichersten warst.«</w:t>
       </w:r>
     </w:p>
@@ -5241,7 +5241,7 @@
     <w:p/>
     <w:p>
       <w:r>
-        <w:t>Ich setzte mich auf den Stuhl, den Olivia mir zuschob, und nahm die Tasse entgegen, die sie mir in die Hand drückte, und deren Wärme tat so gar nichts gegen die Kälte, die mir in die Arme kroch.</w:t>
+        <w:t xml:space="preserve">Ich setzte mich auf den Stuhl, den Olivia mir zuschob, und nahm die Tasse entgegen, die sie mir in die Hand drückte, doch ihre Wärme tat so gar nichts gegen die Kälte, die mir in die Arme kroch.</w:t>
       </w:r>
     </w:p>
     <w:p/>
@@ -5759,7 +5759,7 @@
     </w:p>
     <w:p>
       <w:r>
-        <w:t>»Doc hat in Gretas Mehl ein Säuerungsmittel gefunden«, sagte ich. »Die Sorte, die eine Bäckerei für Roggenbrot kauft. Eine Bäckerei in Bridgton hat Gretas Kunden namentlich angerufen und ihnen angeboten, ihre Holly-Jolly-Bestellungen zu übernehmen. Und die Firma, die im August geschrieben hat, um Greta herauszukaufen, ist auf die Frau registriert, der diese Bäckerei gehört.« Ich holte Luft vor der einen Frage, wegen der ich angerufen hatte. »Kannst du herausfinden, ob Pelkey's in Lewiston diesen Herbst ein Säuerungsmittel an Wendt's Bakehouse geliefert hat?«</w:t>
+        <w:t xml:space="preserve">»Doc hat in Gretas Mehl ein Säuerungsmittel gefunden«, sagte ich. »Die Sorte, die eine Bäckerei für Roggenbrot kauft. Eine Bäckerei in Bridgton hat Gretas Kunden namentlich angerufen und ihnen angeboten, ihre Holly-Jolly-Bestellungen zu übernehmen. Und die Firma, die im August geschrieben hat, um Greta aufzukaufen, ist auf die Frau registriert, der diese Bäckerei gehört.« Ich holte Luft vor der einen Frage, wegen der ich angerufen hatte. »Kannst du herausfinden, ob Pelkey's in Lewiston diesen Herbst ein Säuerungsmittel an Wendt's Bakehouse geliefert hat?«</w:t>
       </w:r>
     </w:p>
     <w:p>
@@ -5973,7 +5973,7 @@
     </w:p>
     <w:p>
       <w:r>
-        <w:t>»Danny Ott sah vor Tagesanbruch eine schmale, flinke Gestalt an Gretas Schwelle, die sich zum entgegengesetzten Ende hin entfernte. Eines anderen Morgens sah er einen Karton mit goldenem Etikett an ihrer Tür. Claires Seite bringt Joyce mit dem Anwaltsbrief in Verbindung, den Greta im August zerriss.« Ich berührte das gefaltete Papier auf meinem Schoß. »Renées Flyer für ihre Eröffnungswoche lag im Oktober als Andruck auf ihrer Theke, während Joyce sie mit Proben aufsuchte, und die Beschwerde ging genau in dieser Woche ein. Der Flyer hing erst am Dreißigsten am Brett der Grange. Pelkeys Sack ging am Siebenundzwanzigsten nach Bridgton. Und Docs Notiz besagt, dass das Pulver in meinem Glas exakt zum Säuerungsmittel passt, Test für Test.«</w:t>
+        <w:t xml:space="preserve">»Danny Ott sah vor Tagesanbruch eine schmale, flinke Gestalt an Gretas Schwelle, die sich zum fernen Ende hin entfernte. Eines anderen Morgens sah er einen Karton mit goldenem Etikett an ihrer Tür. Claires Seite bringt Joyce mit dem Anwaltsbrief in Verbindung, den Greta im August zerriss.« Ich berührte das gefaltete Papier auf meinem Schoß. »Renées Flyer für ihre Eröffnungswoche lag im Oktober als Andruck auf ihrer Theke, während Joyce sie mit Proben aufsuchte, und die Beschwerde ging genau in dieser Woche ein. Der Flyer hing erst am Dreißigsten am Brett der Grange. Pelkeys Sack ging am Siebenundzwanzigsten nach Bridgton. Und Docs Notiz besagt, dass das Pulver in meinem Glas exakt zum Säuerungsmittel passt, Test für Test.«</w:t>
       </w:r>
     </w:p>
     <w:p>
@@ -6212,7 +6212,7 @@
     <w:p/>
     <w:p>
       <w:r>
-        <w:t>Sie ging um das Ende des Tischs herum, als wolle sie sie in die Arme schließen, aber Greta stand nicht auf. Joyce blieb mit einer Hand auf der Lehne von Gretas Stuhl stehen, klopfte ihm leicht darauf und ging zu dem leeren Platz uns gegenüber zurück, als sei das von Anfang an ihr Plan gewesen.</w:t>
+        <w:t xml:space="preserve">Sie ging um das Ende des Tischs herum, als wolle sie sie in die Arme schließen, aber Greta stand nicht auf. Joyce blieb mit einer Hand auf der Lehne von Gretas Stuhl stehen, klopfte leicht darauf und ging zu dem leeren Platz uns gegenüber zurück, als sei das von Anfang an ihr Plan gewesen.</w:t>
       </w:r>
     </w:p>
     <w:p/>
@@ -6386,7 +6386,7 @@
     <w:p/>
     <w:p>
       <w:r>
-        <w:t>»Der Kuchen gehörte mir. Ich habe ihn an diesem Arbeitstisch im ersten Winter ausgetüftelt, mit dem Pekannusskuchen meiner Mutter und einem halben Kilo Schokolade, das wir uns nicht leisten konnten. Der Laden gehörte zur Hälfte mir. Ich habe diesen Boden auf den Knien geschrubbt, bevor wir jemals die Tür geöffnet haben. Fünfzehn Jahre, Seite an Seite. Und sie hat alles behalten. Den Namen über der Tür. Den Kuchen.« Ihre Stimme blieb durchgehend ruhig. »Jedes Thanksgiving seit fünfundzwanzig Jahren stehen die Leute für Gretas Schokoladen-Pekannuss-Kuchen in einer Schlange vor dieser Tür. In diesem Kasten in der Grange liegt eine Karte mit dem Rezept darauf. Sie vergraben sie gerade. Ich habe sie gelesen, während ich Brot für Hal auslud. Gretas. In deiner Handschrift.«</w:t>
+        <w:t xml:space="preserve">»Der Kuchen gehörte mir. Ich habe ihn an diesem Arbeitstisch im ersten Winter ausgetüftelt, mit dem Pekannusskuchen meiner Mutter und einem halben Kilo Schokolade, das wir uns nicht leisten konnten. Der Laden gehörte zur Hälfte mir. Ich habe diesen Boden auf den Knien geschrubbt, bevor wir jemals die Tür geöffnet haben. Fünfzehn Jahre, Seite an Seite. Und sie hat alles behalten. Den Namen über der Tür. Den Kuchen.« Ihre Stimme blieb durchgehend ruhig. »Jedes Thanksgiving seit fünfundzwanzig Jahren stehen die Leute für Gretas Schokoladen-Pekannuss-Kuchen in einer Schlange vor dieser Tür. In diesem Kasten in der Grange liegt eine Karte mit dem Rezept darauf. Die soll mit vergraben werden. Ich habe sie gelesen, während ich Brot für Hal auslud. Gretas. In deiner Handschrift.«</w:t>
       </w:r>
     </w:p>
     <w:p/>
@@ -6398,7 +6398,7 @@
     <w:p/>
     <w:p>
       <w:r>
-        <w:t>»Ich habe dich ausgezahlt«, sagte sie. »Ich habe dich acht Jahre lang jeden Monat ausgezahlt, Joyce, und in manchen Monaten habe ich dich ausgezahlt, bevor ich das Heizöl bezahlt habe, und ich habe die Quittungen immer noch in einer Schuhschachtel, wenn die Polizeichefin sie lesen will. Du hast mich gebeten, dich herauszukaufen. Du hast in dieser Küche gestanden und mir gesagt, du hättest genug von Kuchen um vier Uhr morgens, du wolltest Brot, echtes Brot, Großhandel, Lkw, Kundenkarteien, und ich habe gesagt, in Ordnung. Und ich habe dich bezahlt.«</w:t>
+        <w:t xml:space="preserve">»Ich habe dich ausgezahlt«, sagte sie. »Ich habe dich acht Jahre lang jeden Monat ausgezahlt, Joyce, und in manchen Monaten habe ich dich ausgezahlt, bevor ich das Heizöl bezahlt habe, und ich habe die Quittungen immer noch in einer Schuhschachtel, wenn die Polizeichefin sie lesen will. Du hast mich gebeten, dich auszuzahlen. Du hast in dieser Küche gestanden und mir gesagt, du hättest genug von Kuchen um vier Uhr morgens, du wolltest Brot, echtes Brot, Großhandel, Lkw, Kundenkarteien, und ich habe gesagt, in Ordnung. Und ich habe dich bezahlt.«</w:t>
       </w:r>
     </w:p>
     <w:p/>
@@ -6965,7 +6965,7 @@
     <w:p/>
     <w:p>
       <w:r>
-        <w:t>Sie zog mich hinter die Vitrine, als sich die Schlange lichtete, in die Wärme im hinteren Bereich, wo die Öfen tickten, und zeigte mir die Kassenschublade. Sie ging nicht mehr zu. »Sieh sie dir an«, sagte sie. Sie triumphierte nicht. Sie hatte ihre Ersparnisse in gutes Mehl gesteckt und zugesehen, wie es verdarb, Ladung um Ladung, während das gelbe Papier auf ihrer Vitrine lag, und nun wirkte sie einfach nur verblüfft. »Einen Nachmittag lang, Jessica. Und das Gerichtsgeld kommt noch obendrauf, Dollar für Dollar von dem, was sie verdorben hat. Die Polizeichefin hat mir die Summe vorgelesen, die sie fordern werden.« Sie drückte die Schublade mit dem Handballen zu und gab es auf. »Ich war im Minus. Ich will nicht so tun, als wäre ich es nicht gewesen. Ich lag wach und rechnete im Kopf nach, und die Stadt hat es an einem einzigen Nachmittag zurückgezahlt, und niemand nannte es Almosen. Sie nannten es Montag.« Sie blickte durch das beschlagene Glas auf die Schlange, die immer noch in der Kälte stampfte für Zimtschnecken, von denen sie bereits neuen Teig anrührte.</w:t>
+        <w:t xml:space="preserve">Sie zog mich hinter die Vitrine, als sich die Schlange lichtete, in die Wärme im hinteren Bereich, wo die Öfen tickten, und zeigte mir die Kassenschublade. Sie ging nicht mehr zu. »Sieh sie dir an«, sagte sie. Sie triumphierte nicht. Sie hatte ihre Ersparnisse in gutes Mehl gesteckt und zugesehen, wie es verdarb, Ladung um Ladung, während das gelbe Papier auf ihrer Vitrine lag, und nun wirkte sie einfach nur verblüfft. »Einen Nachmittag lang, Jessica. Und das Gerichtsgeld kommt noch obendrauf, Dollar für Dollar von dem, was sie verdorben hat. Die Polizeichefin hat mir die Summe vorgelesen, die sie fordern werden.« Sie drückte mit dem Handballen gegen die Schublade und gab es auf. »Ich war im Minus. Ich will nicht so tun, als wäre ich es nicht gewesen. Ich lag wach und rechnete im Kopf nach, und die Stadt hat es an einem einzigen Nachmittag zurückgezahlt, und niemand nannte es Almosen. Sie nannten es Montag.« Sie blickte durch das beschlagene Glas auf die Schlange, die immer noch in der Kälte stampfte für Zimtschnecken, von denen sie bereits neuen Teig anrührte.</w:t>
       </w:r>
     </w:p>
     <w:p/>
@@ -6989,7 +6989,7 @@
     <w:p/>
     <w:p>
       <w:r>
-        <w:t>»Du hast sie nicht mein Mehl nennen lassen«, sagte sie. Das war alles. Sie hatte den Rest zu Joyce über den Tisch der Polizeichefin hinweg gesagt, und sie brauchte es mir gegenüber nicht zu wiederholen.</w:t>
+        <w:t xml:space="preserve">»Du hast nicht zugelassen, dass sie es meinem Mehl anhängen«, sagte sie. Das war alles. Sie hatte den Rest zu Joyce über den Tisch der Polizeichefin hinweg gesagt, und sie brauchte es mir gegenüber nicht zu wiederholen.</w:t>
       </w:r>
     </w:p>
     <w:p/>

</xml_diff>